<commit_message>
Update section 2 and 3
</commit_message>
<xml_diff>
--- a/doc/Calculatorz-Software-Architecutre-Design.docx
+++ b/doc/Calculatorz-Software-Architecutre-Design.docx
@@ -1,6 +1,6 @@
 
 <file path=word/document.xml><?xml version="1.0" encoding="utf-8"?>
-<w:document xmlns:wpc="http://schemas.microsoft.com/office/word/2010/wordprocessingCanvas" xmlns:cx="http://schemas.microsoft.com/office/drawing/2014/chartex" xmlns:cx1="http://schemas.microsoft.com/office/drawing/2015/9/8/chartex" xmlns:cx2="http://schemas.microsoft.com/office/drawing/2015/10/21/chartex" xmlns:cx3="http://schemas.microsoft.com/office/drawing/2016/5/9/chartex" xmlns:cx4="http://schemas.microsoft.com/office/drawing/2016/5/10/chartex" xmlns:cx5="http://schemas.microsoft.com/office/drawing/2016/5/11/chartex" xmlns:cx6="http://schemas.microsoft.com/office/drawing/2016/5/12/chartex" xmlns:cx7="http://schemas.microsoft.com/office/drawing/2016/5/13/chartex" xmlns:cx8="http://schemas.microsoft.com/office/drawing/2016/5/14/chartex" xmlns:mc="http://schemas.openxmlformats.org/markup-compatibility/2006" xmlns:aink="http://schemas.microsoft.com/office/drawing/2016/ink" xmlns:am3d="http://schemas.microsoft.com/office/drawing/2017/model3d" xmlns:o="urn:schemas-microsoft-com:office:office" xmlns:oel="http://schemas.microsoft.com/office/2019/extlst" xmlns:r="http://schemas.openxmlformats.org/officeDocument/2006/relationships" xmlns:m="http://schemas.openxmlformats.org/officeDocument/2006/math" xmlns:v="urn:schemas-microsoft-com:vml" xmlns:wp14="http://schemas.microsoft.com/office/word/2010/wordprocessingDrawing" xmlns:wp="http://schemas.openxmlformats.org/drawingml/2006/wordprocessingDrawing" xmlns:w10="urn:schemas-microsoft-com:office:word" xmlns:w="http://schemas.openxmlformats.org/wordprocessingml/2006/main" xmlns:w14="http://schemas.microsoft.com/office/word/2010/wordml" xmlns:w15="http://schemas.microsoft.com/office/word/2012/wordml" xmlns:w16cex="http://schemas.microsoft.com/office/word/2018/wordml/cex" xmlns:w16cid="http://schemas.microsoft.com/office/word/2016/wordml/cid" xmlns:w16="http://schemas.microsoft.com/office/word/2018/wordml" xmlns:w16du="http://schemas.microsoft.com/office/word/2023/wordml/word16du" xmlns:w16sdtdh="http://schemas.microsoft.com/office/word/2020/wordml/sdtdatahash" xmlns:w16sdtfl="http://schemas.microsoft.com/office/word/2024/wordml/sdtformatlock" xmlns:w16se="http://schemas.microsoft.com/office/word/2015/wordml/symex" xmlns:wpg="http://schemas.microsoft.com/office/word/2010/wordprocessingGroup" xmlns:wpi="http://schemas.microsoft.com/office/word/2010/wordprocessingInk" xmlns:wne="http://schemas.microsoft.com/office/word/2006/wordml" xmlns:wps="http://schemas.microsoft.com/office/word/2010/wordprocessingShape" mc:Ignorable="w14 w15 w16se w16cid w16 w16cex w16sdtdh w16sdtfl w16du wp14">
+<w:document xmlns:wpc="http://schemas.microsoft.com/office/word/2010/wordprocessingCanvas" xmlns:cx="http://schemas.microsoft.com/office/drawing/2014/chartex" xmlns:cx1="http://schemas.microsoft.com/office/drawing/2015/9/8/chartex" xmlns:cx2="http://schemas.microsoft.com/office/drawing/2015/10/21/chartex" xmlns:cx3="http://schemas.microsoft.com/office/drawing/2016/5/9/chartex" xmlns:cx4="http://schemas.microsoft.com/office/drawing/2016/5/10/chartex" xmlns:cx5="http://schemas.microsoft.com/office/drawing/2016/5/11/chartex" xmlns:cx6="http://schemas.microsoft.com/office/drawing/2016/5/12/chartex" xmlns:cx7="http://schemas.microsoft.com/office/drawing/2016/5/13/chartex" xmlns:cx8="http://schemas.microsoft.com/office/drawing/2016/5/14/chartex" xmlns:mc="http://schemas.openxmlformats.org/markup-compatibility/2006" xmlns:aink="http://schemas.microsoft.com/office/drawing/2016/ink" xmlns:am3d="http://schemas.microsoft.com/office/drawing/2017/model3d" xmlns:o="urn:schemas-microsoft-com:office:office" xmlns:oel="http://schemas.microsoft.com/office/2019/extlst" xmlns:r="http://schemas.openxmlformats.org/officeDocument/2006/relationships" xmlns:m="http://schemas.openxmlformats.org/officeDocument/2006/math" xmlns:v="urn:schemas-microsoft-com:vml" xmlns:wp14="http://schemas.microsoft.com/office/word/2010/wordprocessingDrawing" xmlns:wp="http://schemas.openxmlformats.org/drawingml/2006/wordprocessingDrawing" xmlns:w10="urn:schemas-microsoft-com:office:word" xmlns:w="http://schemas.openxmlformats.org/wordprocessingml/2006/main" xmlns:w14="http://schemas.microsoft.com/office/word/2010/wordml" xmlns:w15="http://schemas.microsoft.com/office/word/2012/wordml" xmlns:w16cex="http://schemas.microsoft.com/office/word/2018/wordml/cex" xmlns:w16cid="http://schemas.microsoft.com/office/word/2016/wordml/cid" xmlns:w16="http://schemas.microsoft.com/office/word/2018/wordml" xmlns:w16du="http://schemas.microsoft.com/office/word/2023/wordml/word16du" xmlns:w16sdtdh="http://schemas.microsoft.com/office/word/2020/wordml/sdtdatahash" xmlns:w16se="http://schemas.microsoft.com/office/word/2015/wordml/symex" xmlns:wpg="http://schemas.microsoft.com/office/word/2010/wordprocessingGroup" xmlns:wpi="http://schemas.microsoft.com/office/word/2010/wordprocessingInk" xmlns:wne="http://schemas.microsoft.com/office/word/2006/wordml" xmlns:wps="http://schemas.microsoft.com/office/word/2010/wordprocessingShape" mc:Ignorable="w14 w15 w16se w16cid w16 w16cex w16sdtdh w16du wp14">
   <w:body>
     <w:p>
       <w:pPr>
@@ -1232,15 +1232,7 @@
       </w:pPr>
       <w:bookmarkStart w:id="4" w:name="_Toc456598588"/>
       <w:r>
-        <w:t xml:space="preserve">[This document provides a comprehensive architectural overview of the system, using </w:t>
-      </w:r>
-      <w:proofErr w:type="gramStart"/>
-      <w:r>
-        <w:t>a number of</w:t>
-      </w:r>
-      <w:proofErr w:type="gramEnd"/>
-      <w:r>
-        <w:t xml:space="preserve"> different architectural views to depict different aspects of the system. It is intended to capture and convey the significant architectural decisions which have been made on the system.]</w:t>
+        <w:t>[This document provides a comprehensive architectural overview of the system, using a number of different architectural views to depict different aspects of the system. It is intended to capture and convey the significant architectural decisions which have been made on the system.]</w:t>
       </w:r>
     </w:p>
     <w:p>
@@ -1524,6 +1516,102 @@
       <w:r>
         <w:t>[This section describes what software architecture is for the current system, and how it is represented. It enumerates the views that are necessary, and for each view, explains what types of model elements it contains.]</w:t>
       </w:r>
+      <w:r>
+        <w:tab/>
+      </w:r>
+    </w:p>
+    <w:p>
+      <w:pPr>
+        <w:pStyle w:val="BodyText"/>
+      </w:pPr>
+      <w:r>
+        <w:t>The system uses a modular pipeline architecture, where each module handles a specific step in processing an expression</w:t>
+      </w:r>
+    </w:p>
+    <w:p>
+      <w:pPr>
+        <w:pStyle w:val="BodyText"/>
+      </w:pPr>
+      <w:r>
+        <w:t>Main components including:</w:t>
+      </w:r>
+    </w:p>
+    <w:p>
+      <w:pPr>
+        <w:pStyle w:val="BodyText"/>
+        <w:numPr>
+          <w:ilvl w:val="0"/>
+          <w:numId w:val="31"/>
+        </w:numPr>
+      </w:pPr>
+      <w:r>
+        <w:t>User Interface: handles input and displays results/errors</w:t>
+      </w:r>
+    </w:p>
+    <w:p>
+      <w:pPr>
+        <w:pStyle w:val="BodyText"/>
+        <w:numPr>
+          <w:ilvl w:val="0"/>
+          <w:numId w:val="31"/>
+        </w:numPr>
+      </w:pPr>
+      <w:r>
+        <w:t>Tokenizer: converts input into token for a more structured evaluation</w:t>
+      </w:r>
+    </w:p>
+    <w:p>
+      <w:pPr>
+        <w:pStyle w:val="BodyText"/>
+        <w:numPr>
+          <w:ilvl w:val="0"/>
+          <w:numId w:val="31"/>
+        </w:numPr>
+      </w:pPr>
+      <w:r>
+        <w:t>Prioritization: applies operator precedence</w:t>
+      </w:r>
+      <w:r>
+        <w:t xml:space="preserve"> and organizes tokens </w:t>
+      </w:r>
+    </w:p>
+    <w:p>
+      <w:pPr>
+        <w:pStyle w:val="BodyText"/>
+        <w:numPr>
+          <w:ilvl w:val="0"/>
+          <w:numId w:val="31"/>
+        </w:numPr>
+      </w:pPr>
+      <w:r>
+        <w:t>Evaluation</w:t>
+      </w:r>
+      <w:r>
+        <w:t>: compute the final result</w:t>
+      </w:r>
+    </w:p>
+    <w:p>
+      <w:pPr>
+        <w:pStyle w:val="BodyText"/>
+        <w:numPr>
+          <w:ilvl w:val="0"/>
+          <w:numId w:val="31"/>
+        </w:numPr>
+      </w:pPr>
+      <w:r>
+        <w:t>Error Handler</w:t>
+      </w:r>
+      <w:r>
+        <w:t>: detects and reports errors with positions</w:t>
+      </w:r>
+    </w:p>
+    <w:p>
+      <w:pPr>
+        <w:pStyle w:val="BodyText"/>
+      </w:pPr>
+      <w:r>
+        <w:t>Each module is dependent, improving maintainability and debugging.</w:t>
+      </w:r>
     </w:p>
     <w:p>
       <w:pPr>
@@ -1531,6 +1619,7 @@
       </w:pPr>
       <w:bookmarkStart w:id="13" w:name="_Toc6187934"/>
       <w:r>
+        <w:lastRenderedPageBreak/>
         <w:t>Architectural Goals and Constraints</w:t>
       </w:r>
       <w:bookmarkEnd w:id="13"/>
@@ -1543,23 +1632,139 @@
         <w:pStyle w:val="InfoBlue"/>
       </w:pPr>
       <w:r>
-        <w:t xml:space="preserve">[This section describes the software requirements and objectives that have some significant impact on the </w:t>
-      </w:r>
-      <w:proofErr w:type="gramStart"/>
-      <w:r>
-        <w:t>architecture;</w:t>
-      </w:r>
-      <w:proofErr w:type="gramEnd"/>
-      <w:r>
-        <w:t xml:space="preserve"> for example, safety, security, privacy, use of an off-the-shelf product, portability, distribution, and reuse. It also captures the special constraints that may </w:t>
-      </w:r>
-      <w:proofErr w:type="gramStart"/>
-      <w:r>
-        <w:t>apply:</w:t>
-      </w:r>
-      <w:proofErr w:type="gramEnd"/>
-      <w:r>
-        <w:t xml:space="preserve"> design and implementation strategy, development tools, team structure, schedule, legacy code, and so on.]</w:t>
+        <w:t>[This section describes the software requirements and objectives that have some significant impact on the architecture; for example, safety, security, privacy, use of an off-the-shelf product, portability, distribution, and reuse. It also captures the special constraints that may apply: design and implementation strategy, development tools, team structure, schedule, legacy code, and so on.]</w:t>
+      </w:r>
+    </w:p>
+    <w:p>
+      <w:pPr>
+        <w:pStyle w:val="BodyText"/>
+        <w:numPr>
+          <w:ilvl w:val="0"/>
+          <w:numId w:val="31"/>
+        </w:numPr>
+      </w:pPr>
+      <w:r>
+        <w:t>Goals:</w:t>
+      </w:r>
+    </w:p>
+    <w:p>
+      <w:pPr>
+        <w:pStyle w:val="BodyText"/>
+        <w:numPr>
+          <w:ilvl w:val="1"/>
+          <w:numId w:val="31"/>
+        </w:numPr>
+      </w:pPr>
+      <w:r>
+        <w:t xml:space="preserve">Modularity: separate UI, tokenizer, parser, and evaluator </w:t>
+      </w:r>
+    </w:p>
+    <w:p>
+      <w:pPr>
+        <w:pStyle w:val="BodyText"/>
+        <w:numPr>
+          <w:ilvl w:val="1"/>
+          <w:numId w:val="31"/>
+        </w:numPr>
+      </w:pPr>
+      <w:r>
+        <w:t>Correctness: follow standard arithmetic rules</w:t>
+      </w:r>
+    </w:p>
+    <w:p>
+      <w:pPr>
+        <w:pStyle w:val="BodyText"/>
+        <w:numPr>
+          <w:ilvl w:val="1"/>
+          <w:numId w:val="31"/>
+        </w:numPr>
+      </w:pPr>
+      <w:r>
+        <w:t>Error Handling: detect invalid input and highlights errors</w:t>
+      </w:r>
+    </w:p>
+    <w:p>
+      <w:pPr>
+        <w:pStyle w:val="BodyText"/>
+        <w:numPr>
+          <w:ilvl w:val="1"/>
+          <w:numId w:val="31"/>
+        </w:numPr>
+      </w:pPr>
+      <w:r>
+        <w:t>Usability: clear results and messages</w:t>
+      </w:r>
+    </w:p>
+    <w:p>
+      <w:pPr>
+        <w:pStyle w:val="BodyText"/>
+        <w:numPr>
+          <w:ilvl w:val="0"/>
+          <w:numId w:val="31"/>
+        </w:numPr>
+      </w:pPr>
+      <w:r>
+        <w:t>Constraints:</w:t>
+      </w:r>
+    </w:p>
+    <w:p>
+      <w:pPr>
+        <w:pStyle w:val="BodyText"/>
+        <w:numPr>
+          <w:ilvl w:val="1"/>
+          <w:numId w:val="31"/>
+        </w:numPr>
+      </w:pPr>
+      <w:r>
+        <w:t>Implemented in C++</w:t>
+      </w:r>
+    </w:p>
+    <w:p>
+      <w:pPr>
+        <w:pStyle w:val="BodyText"/>
+        <w:numPr>
+          <w:ilvl w:val="1"/>
+          <w:numId w:val="31"/>
+        </w:numPr>
+      </w:pPr>
+      <w:r>
+        <w:t>UI built with Qt</w:t>
+      </w:r>
+    </w:p>
+    <w:p>
+      <w:pPr>
+        <w:pStyle w:val="BodyText"/>
+        <w:numPr>
+          <w:ilvl w:val="1"/>
+          <w:numId w:val="31"/>
+        </w:numPr>
+      </w:pPr>
+      <w:r>
+        <w:t>Supports basic operations</w:t>
+      </w:r>
+    </w:p>
+    <w:p>
+      <w:pPr>
+        <w:pStyle w:val="BodyText"/>
+        <w:numPr>
+          <w:ilvl w:val="1"/>
+          <w:numId w:val="31"/>
+        </w:numPr>
+      </w:pPr>
+      <w:r>
+        <w:t>Handles single-line expressions</w:t>
+      </w:r>
+    </w:p>
+    <w:p>
+      <w:pPr>
+        <w:pStyle w:val="BodyText"/>
+        <w:numPr>
+          <w:ilvl w:val="1"/>
+          <w:numId w:val="31"/>
+        </w:numPr>
+      </w:pPr>
+      <w:r>
+        <w:t xml:space="preserve">Run efficiently </w:t>
       </w:r>
     </w:p>
     <w:p>
@@ -1619,132 +1824,104 @@
         <w:rPr>
           <w:highlight w:val="yellow"/>
         </w:rPr>
-        <w:t xml:space="preserve">[This section illustrates how the software </w:t>
-      </w:r>
-      <w:proofErr w:type="gramStart"/>
-      <w:r>
-        <w:rPr>
-          <w:highlight w:val="yellow"/>
-        </w:rPr>
-        <w:t>actually works</w:t>
-      </w:r>
-      <w:proofErr w:type="gramEnd"/>
-      <w:r>
-        <w:rPr>
-          <w:highlight w:val="yellow"/>
-        </w:rPr>
-        <w:t xml:space="preserve"> by giving a few selected use-case (or scenario) </w:t>
-      </w:r>
-      <w:proofErr w:type="gramStart"/>
-      <w:r>
-        <w:rPr>
-          <w:highlight w:val="yellow"/>
-        </w:rPr>
+        <w:t>[This section illustrates how the software actually works by giving a few selected use-case (or scenario) realizations, and explains how the various design model elements contribute to their functionality. If a Use-Case Realization Document is available, refer to it in this section.]</w:t>
+      </w:r>
+    </w:p>
+    <w:p/>
+    <w:p>
+      <w:pPr>
+        <w:pStyle w:val="Heading1"/>
+      </w:pPr>
+      <w:bookmarkStart w:id="16" w:name="_Toc6187937"/>
+      <w:r>
+        <w:t>Logical View</w:t>
+      </w:r>
+      <w:bookmarkEnd w:id="16"/>
+      <w:r>
+        <w:t xml:space="preserve"> </w:t>
+      </w:r>
+    </w:p>
+    <w:p>
+      <w:pPr>
+        <w:pStyle w:val="InfoBlue"/>
+      </w:pPr>
+      <w:r>
+        <w:t>[This section describes the architecturally significant parts of the design model, such as its decomposition into subsystems and packages. And for each significant package, its decomposition into classes and class utilities. You should introduce architecturally significant classes and describe their responsibilities, as well as a few very important relationships, operations, and attributes.]</w:t>
+      </w:r>
+    </w:p>
+    <w:p>
+      <w:pPr>
+        <w:pStyle w:val="Heading2"/>
+      </w:pPr>
+      <w:bookmarkStart w:id="17" w:name="_Toc6187938"/>
+      <w:r>
+        <w:t>Overview</w:t>
+      </w:r>
+      <w:bookmarkEnd w:id="17"/>
+    </w:p>
+    <w:p>
+      <w:pPr>
+        <w:pStyle w:val="InfoBlue"/>
+      </w:pPr>
+      <w:r>
+        <w:t>[This subsection describes the overall decomposition of the design model in terms of its package hierarchy and layers.]</w:t>
+      </w:r>
+    </w:p>
+    <w:p>
+      <w:pPr>
+        <w:pStyle w:val="BodyText"/>
+      </w:pPr>
+      <w:r>
+        <w:t xml:space="preserve">Tokenizer, </w:t>
+      </w:r>
+      <w:proofErr w:type="spellStart"/>
+      <w:r>
+        <w:t>Prioritizer</w:t>
+      </w:r>
+      <w:proofErr w:type="spellEnd"/>
+      <w:r>
+        <w:t>, and Evaluator will have their own module which will be included in the other files needed for the program to function.</w:t>
+      </w:r>
+    </w:p>
+    <w:p>
+      <w:pPr>
+        <w:pStyle w:val="Heading2"/>
+      </w:pPr>
+      <w:bookmarkStart w:id="18" w:name="_Toc6187939"/>
+      <w:r>
+        <w:t>Architecturally Significant Design</w:t>
+      </w:r>
+      <w:r>
+        <w:t xml:space="preserve"> Modules or</w:t>
+      </w:r>
+      <w:r>
+        <w:t xml:space="preserve"> Packages</w:t>
+      </w:r>
+      <w:bookmarkEnd w:id="18"/>
+    </w:p>
+    <w:p>
+      <w:pPr>
+        <w:pStyle w:val="InfoBlue"/>
+      </w:pPr>
+      <w:r>
+        <w:t xml:space="preserve">[For each significant package, include a subsection with its name, its brief description, and a diagram with all significant classes and packages contained within the package. </w:t>
+      </w:r>
+    </w:p>
+    <w:p>
+      <w:pPr>
+        <w:pStyle w:val="InfoBlue"/>
+      </w:pPr>
+      <w:r>
+        <w:t>For each significant class in the package, include its name, brief description, and, optionally, a description of some of its major responsibilities, operations, and attributes.]</w:t>
+      </w:r>
+    </w:p>
+    <w:p>
+      <w:pPr>
+        <w:pStyle w:val="BodyText"/>
+      </w:pPr>
+      <w:proofErr w:type="spellStart"/>
+      <w:r>
         <w:lastRenderedPageBreak/>
-        <w:t>realizations, and</w:t>
-      </w:r>
-      <w:proofErr w:type="gramEnd"/>
-      <w:r>
-        <w:rPr>
-          <w:highlight w:val="yellow"/>
-        </w:rPr>
-        <w:t xml:space="preserve"> explains how the various design model elements contribute to their functionality. If a Use-Case Realization Document is available, refer to it in this section.]</w:t>
-      </w:r>
-    </w:p>
-    <w:p/>
-    <w:p>
-      <w:pPr>
-        <w:pStyle w:val="Heading1"/>
-      </w:pPr>
-      <w:bookmarkStart w:id="16" w:name="_Toc6187937"/>
-      <w:r>
-        <w:t>Logical View</w:t>
-      </w:r>
-      <w:bookmarkEnd w:id="16"/>
-      <w:r>
-        <w:t xml:space="preserve"> </w:t>
-      </w:r>
-    </w:p>
-    <w:p>
-      <w:pPr>
-        <w:pStyle w:val="InfoBlue"/>
-      </w:pPr>
-      <w:r>
-        <w:t>[This section describes the architecturally significant parts of the design model, such as its decomposition into subsystems and packages. And for each significant package, its decomposition into classes and class utilities. You should introduce architecturally significant classes and describe their responsibilities, as well as a few very important relationships, operations, and attributes.]</w:t>
-      </w:r>
-    </w:p>
-    <w:p>
-      <w:pPr>
-        <w:pStyle w:val="Heading2"/>
-      </w:pPr>
-      <w:bookmarkStart w:id="17" w:name="_Toc6187938"/>
-      <w:r>
-        <w:t>Overview</w:t>
-      </w:r>
-      <w:bookmarkEnd w:id="17"/>
-    </w:p>
-    <w:p>
-      <w:pPr>
-        <w:pStyle w:val="InfoBlue"/>
-      </w:pPr>
-      <w:r>
-        <w:t>[This subsection describes the overall decomposition of the design model in terms of its package hierarchy and layers.]</w:t>
-      </w:r>
-    </w:p>
-    <w:p>
-      <w:pPr>
-        <w:pStyle w:val="BodyText"/>
-      </w:pPr>
-      <w:r>
-        <w:t xml:space="preserve">Tokenizer, </w:t>
-      </w:r>
-      <w:proofErr w:type="spellStart"/>
-      <w:r>
-        <w:t>Prioritizer</w:t>
-      </w:r>
-      <w:proofErr w:type="spellEnd"/>
-      <w:r>
-        <w:t>, and Evaluator will have their own module which will be included in the other files needed for the program to function.</w:t>
-      </w:r>
-    </w:p>
-    <w:p>
-      <w:pPr>
-        <w:pStyle w:val="Heading2"/>
-      </w:pPr>
-      <w:bookmarkStart w:id="18" w:name="_Toc6187939"/>
-      <w:r>
-        <w:t>Architecturally Significant Design</w:t>
-      </w:r>
-      <w:r>
-        <w:t xml:space="preserve"> Modules or</w:t>
-      </w:r>
-      <w:r>
-        <w:t xml:space="preserve"> Packages</w:t>
-      </w:r>
-      <w:bookmarkEnd w:id="18"/>
-    </w:p>
-    <w:p>
-      <w:pPr>
-        <w:pStyle w:val="InfoBlue"/>
-      </w:pPr>
-      <w:r>
-        <w:t xml:space="preserve">[For each significant package, include a subsection with its name, its brief description, and a diagram with all significant classes and packages contained within the package. </w:t>
-      </w:r>
-    </w:p>
-    <w:p>
-      <w:pPr>
-        <w:pStyle w:val="InfoBlue"/>
-      </w:pPr>
-      <w:r>
-        <w:t>For each significant class in the package, include its name, brief description, and, optionally, a description of some of its major responsibilities, operations, and attributes.]</w:t>
-      </w:r>
-    </w:p>
-    <w:p>
-      <w:pPr>
-        <w:pStyle w:val="BodyText"/>
-      </w:pPr>
-      <w:proofErr w:type="spellStart"/>
-      <w:r>
         <w:t>randomDiceRoll</w:t>
       </w:r>
       <w:proofErr w:type="spellEnd"/>
@@ -1959,7 +2136,6 @@
       </w:pPr>
       <w:bookmarkStart w:id="21" w:name="_Toc6187942"/>
       <w:r>
-        <w:lastRenderedPageBreak/>
         <w:t>Quality</w:t>
       </w:r>
       <w:bookmarkEnd w:id="21"/>
@@ -1989,7 +2165,7 @@
 </file>
 
 <file path=word/endnotes.xml><?xml version="1.0" encoding="utf-8"?>
-<w:endnotes xmlns:wpc="http://schemas.microsoft.com/office/word/2010/wordprocessingCanvas" xmlns:cx="http://schemas.microsoft.com/office/drawing/2014/chartex" xmlns:cx1="http://schemas.microsoft.com/office/drawing/2015/9/8/chartex" xmlns:cx2="http://schemas.microsoft.com/office/drawing/2015/10/21/chartex" xmlns:cx3="http://schemas.microsoft.com/office/drawing/2016/5/9/chartex" xmlns:cx4="http://schemas.microsoft.com/office/drawing/2016/5/10/chartex" xmlns:cx5="http://schemas.microsoft.com/office/drawing/2016/5/11/chartex" xmlns:cx6="http://schemas.microsoft.com/office/drawing/2016/5/12/chartex" xmlns:cx7="http://schemas.microsoft.com/office/drawing/2016/5/13/chartex" xmlns:cx8="http://schemas.microsoft.com/office/drawing/2016/5/14/chartex" xmlns:mc="http://schemas.openxmlformats.org/markup-compatibility/2006" xmlns:aink="http://schemas.microsoft.com/office/drawing/2016/ink" xmlns:am3d="http://schemas.microsoft.com/office/drawing/2017/model3d" xmlns:o="urn:schemas-microsoft-com:office:office" xmlns:oel="http://schemas.microsoft.com/office/2019/extlst" xmlns:r="http://schemas.openxmlformats.org/officeDocument/2006/relationships" xmlns:m="http://schemas.openxmlformats.org/officeDocument/2006/math" xmlns:v="urn:schemas-microsoft-com:vml" xmlns:wp14="http://schemas.microsoft.com/office/word/2010/wordprocessingDrawing" xmlns:wp="http://schemas.openxmlformats.org/drawingml/2006/wordprocessingDrawing" xmlns:w10="urn:schemas-microsoft-com:office:word" xmlns:w="http://schemas.openxmlformats.org/wordprocessingml/2006/main" xmlns:w14="http://schemas.microsoft.com/office/word/2010/wordml" xmlns:w15="http://schemas.microsoft.com/office/word/2012/wordml" xmlns:w16cex="http://schemas.microsoft.com/office/word/2018/wordml/cex" xmlns:w16cid="http://schemas.microsoft.com/office/word/2016/wordml/cid" xmlns:w16="http://schemas.microsoft.com/office/word/2018/wordml" xmlns:w16du="http://schemas.microsoft.com/office/word/2023/wordml/word16du" xmlns:w16sdtdh="http://schemas.microsoft.com/office/word/2020/wordml/sdtdatahash" xmlns:w16sdtfl="http://schemas.microsoft.com/office/word/2024/wordml/sdtformatlock" xmlns:w16se="http://schemas.microsoft.com/office/word/2015/wordml/symex" xmlns:wpg="http://schemas.microsoft.com/office/word/2010/wordprocessingGroup" xmlns:wpi="http://schemas.microsoft.com/office/word/2010/wordprocessingInk" xmlns:wne="http://schemas.microsoft.com/office/word/2006/wordml" xmlns:wps="http://schemas.microsoft.com/office/word/2010/wordprocessingShape" mc:Ignorable="w14 w15 w16se w16cid w16 w16cex w16sdtdh w16sdtfl w16du wp14">
+<w:endnotes xmlns:wpc="http://schemas.microsoft.com/office/word/2010/wordprocessingCanvas" xmlns:cx="http://schemas.microsoft.com/office/drawing/2014/chartex" xmlns:cx1="http://schemas.microsoft.com/office/drawing/2015/9/8/chartex" xmlns:cx2="http://schemas.microsoft.com/office/drawing/2015/10/21/chartex" xmlns:cx3="http://schemas.microsoft.com/office/drawing/2016/5/9/chartex" xmlns:cx4="http://schemas.microsoft.com/office/drawing/2016/5/10/chartex" xmlns:cx5="http://schemas.microsoft.com/office/drawing/2016/5/11/chartex" xmlns:cx6="http://schemas.microsoft.com/office/drawing/2016/5/12/chartex" xmlns:cx7="http://schemas.microsoft.com/office/drawing/2016/5/13/chartex" xmlns:cx8="http://schemas.microsoft.com/office/drawing/2016/5/14/chartex" xmlns:mc="http://schemas.openxmlformats.org/markup-compatibility/2006" xmlns:aink="http://schemas.microsoft.com/office/drawing/2016/ink" xmlns:am3d="http://schemas.microsoft.com/office/drawing/2017/model3d" xmlns:o="urn:schemas-microsoft-com:office:office" xmlns:oel="http://schemas.microsoft.com/office/2019/extlst" xmlns:r="http://schemas.openxmlformats.org/officeDocument/2006/relationships" xmlns:m="http://schemas.openxmlformats.org/officeDocument/2006/math" xmlns:v="urn:schemas-microsoft-com:vml" xmlns:wp14="http://schemas.microsoft.com/office/word/2010/wordprocessingDrawing" xmlns:wp="http://schemas.openxmlformats.org/drawingml/2006/wordprocessingDrawing" xmlns:w10="urn:schemas-microsoft-com:office:word" xmlns:w="http://schemas.openxmlformats.org/wordprocessingml/2006/main" xmlns:w14="http://schemas.microsoft.com/office/word/2010/wordml" xmlns:w15="http://schemas.microsoft.com/office/word/2012/wordml" xmlns:w16cex="http://schemas.microsoft.com/office/word/2018/wordml/cex" xmlns:w16cid="http://schemas.microsoft.com/office/word/2016/wordml/cid" xmlns:w16="http://schemas.microsoft.com/office/word/2018/wordml" xmlns:w16du="http://schemas.microsoft.com/office/word/2023/wordml/word16du" xmlns:w16sdtdh="http://schemas.microsoft.com/office/word/2020/wordml/sdtdatahash" xmlns:w16se="http://schemas.microsoft.com/office/word/2015/wordml/symex" xmlns:wpg="http://schemas.microsoft.com/office/word/2010/wordprocessingGroup" xmlns:wpi="http://schemas.microsoft.com/office/word/2010/wordprocessingInk" xmlns:wne="http://schemas.microsoft.com/office/word/2006/wordml" xmlns:wps="http://schemas.microsoft.com/office/word/2010/wordprocessingShape" mc:Ignorable="w14 w15 w16se w16cid w16 w16cex w16sdtdh w16du wp14">
   <w:endnote w:type="separator" w:id="-1">
     <w:p>
       <w:pPr>
@@ -2014,7 +2190,7 @@
 </file>
 
 <file path=word/footer1.xml><?xml version="1.0" encoding="utf-8"?>
-<w:ftr xmlns:wpc="http://schemas.microsoft.com/office/word/2010/wordprocessingCanvas" xmlns:cx="http://schemas.microsoft.com/office/drawing/2014/chartex" xmlns:cx1="http://schemas.microsoft.com/office/drawing/2015/9/8/chartex" xmlns:cx2="http://schemas.microsoft.com/office/drawing/2015/10/21/chartex" xmlns:cx3="http://schemas.microsoft.com/office/drawing/2016/5/9/chartex" xmlns:cx4="http://schemas.microsoft.com/office/drawing/2016/5/10/chartex" xmlns:cx5="http://schemas.microsoft.com/office/drawing/2016/5/11/chartex" xmlns:cx6="http://schemas.microsoft.com/office/drawing/2016/5/12/chartex" xmlns:cx7="http://schemas.microsoft.com/office/drawing/2016/5/13/chartex" xmlns:cx8="http://schemas.microsoft.com/office/drawing/2016/5/14/chartex" xmlns:mc="http://schemas.openxmlformats.org/markup-compatibility/2006" xmlns:aink="http://schemas.microsoft.com/office/drawing/2016/ink" xmlns:am3d="http://schemas.microsoft.com/office/drawing/2017/model3d" xmlns:o="urn:schemas-microsoft-com:office:office" xmlns:oel="http://schemas.microsoft.com/office/2019/extlst" xmlns:r="http://schemas.openxmlformats.org/officeDocument/2006/relationships" xmlns:m="http://schemas.openxmlformats.org/officeDocument/2006/math" xmlns:v="urn:schemas-microsoft-com:vml" xmlns:wp14="http://schemas.microsoft.com/office/word/2010/wordprocessingDrawing" xmlns:wp="http://schemas.openxmlformats.org/drawingml/2006/wordprocessingDrawing" xmlns:w10="urn:schemas-microsoft-com:office:word" xmlns:w="http://schemas.openxmlformats.org/wordprocessingml/2006/main" xmlns:w14="http://schemas.microsoft.com/office/word/2010/wordml" xmlns:w15="http://schemas.microsoft.com/office/word/2012/wordml" xmlns:w16cex="http://schemas.microsoft.com/office/word/2018/wordml/cex" xmlns:w16cid="http://schemas.microsoft.com/office/word/2016/wordml/cid" xmlns:w16="http://schemas.microsoft.com/office/word/2018/wordml" xmlns:w16du="http://schemas.microsoft.com/office/word/2023/wordml/word16du" xmlns:w16sdtdh="http://schemas.microsoft.com/office/word/2020/wordml/sdtdatahash" xmlns:w16sdtfl="http://schemas.microsoft.com/office/word/2024/wordml/sdtformatlock" xmlns:w16se="http://schemas.microsoft.com/office/word/2015/wordml/symex" xmlns:wpg="http://schemas.microsoft.com/office/word/2010/wordprocessingGroup" xmlns:wpi="http://schemas.microsoft.com/office/word/2010/wordprocessingInk" xmlns:wne="http://schemas.microsoft.com/office/word/2006/wordml" xmlns:wps="http://schemas.microsoft.com/office/word/2010/wordprocessingShape" mc:Ignorable="w14 w15 w16se w16cid w16 w16cex w16sdtdh w16sdtfl w16du wp14">
+<w:ftr xmlns:wpc="http://schemas.microsoft.com/office/word/2010/wordprocessingCanvas" xmlns:cx="http://schemas.microsoft.com/office/drawing/2014/chartex" xmlns:cx1="http://schemas.microsoft.com/office/drawing/2015/9/8/chartex" xmlns:cx2="http://schemas.microsoft.com/office/drawing/2015/10/21/chartex" xmlns:cx3="http://schemas.microsoft.com/office/drawing/2016/5/9/chartex" xmlns:cx4="http://schemas.microsoft.com/office/drawing/2016/5/10/chartex" xmlns:cx5="http://schemas.microsoft.com/office/drawing/2016/5/11/chartex" xmlns:cx6="http://schemas.microsoft.com/office/drawing/2016/5/12/chartex" xmlns:cx7="http://schemas.microsoft.com/office/drawing/2016/5/13/chartex" xmlns:cx8="http://schemas.microsoft.com/office/drawing/2016/5/14/chartex" xmlns:mc="http://schemas.openxmlformats.org/markup-compatibility/2006" xmlns:aink="http://schemas.microsoft.com/office/drawing/2016/ink" xmlns:am3d="http://schemas.microsoft.com/office/drawing/2017/model3d" xmlns:o="urn:schemas-microsoft-com:office:office" xmlns:oel="http://schemas.microsoft.com/office/2019/extlst" xmlns:r="http://schemas.openxmlformats.org/officeDocument/2006/relationships" xmlns:m="http://schemas.openxmlformats.org/officeDocument/2006/math" xmlns:v="urn:schemas-microsoft-com:vml" xmlns:wp14="http://schemas.microsoft.com/office/word/2010/wordprocessingDrawing" xmlns:wp="http://schemas.openxmlformats.org/drawingml/2006/wordprocessingDrawing" xmlns:w10="urn:schemas-microsoft-com:office:word" xmlns:w="http://schemas.openxmlformats.org/wordprocessingml/2006/main" xmlns:w14="http://schemas.microsoft.com/office/word/2010/wordml" xmlns:w15="http://schemas.microsoft.com/office/word/2012/wordml" xmlns:w16cex="http://schemas.microsoft.com/office/word/2018/wordml/cex" xmlns:w16cid="http://schemas.microsoft.com/office/word/2016/wordml/cid" xmlns:w16="http://schemas.microsoft.com/office/word/2018/wordml" xmlns:w16du="http://schemas.microsoft.com/office/word/2023/wordml/word16du" xmlns:w16sdtdh="http://schemas.microsoft.com/office/word/2020/wordml/sdtdatahash" xmlns:w16se="http://schemas.microsoft.com/office/word/2015/wordml/symex" xmlns:wpg="http://schemas.microsoft.com/office/word/2010/wordprocessingGroup" xmlns:wpi="http://schemas.microsoft.com/office/word/2010/wordprocessingInk" xmlns:wne="http://schemas.microsoft.com/office/word/2006/wordml" xmlns:wps="http://schemas.microsoft.com/office/word/2010/wordprocessingShape" mc:Ignorable="w14 w15 w16se w16cid w16 w16cex w16sdtdh w16du wp14">
   <w:p>
     <w:pPr>
       <w:pStyle w:val="Footer"/>
@@ -2052,7 +2228,7 @@
 </file>
 
 <file path=word/footer2.xml><?xml version="1.0" encoding="utf-8"?>
-<w:ftr xmlns:wpc="http://schemas.microsoft.com/office/word/2010/wordprocessingCanvas" xmlns:cx="http://schemas.microsoft.com/office/drawing/2014/chartex" xmlns:cx1="http://schemas.microsoft.com/office/drawing/2015/9/8/chartex" xmlns:cx2="http://schemas.microsoft.com/office/drawing/2015/10/21/chartex" xmlns:cx3="http://schemas.microsoft.com/office/drawing/2016/5/9/chartex" xmlns:cx4="http://schemas.microsoft.com/office/drawing/2016/5/10/chartex" xmlns:cx5="http://schemas.microsoft.com/office/drawing/2016/5/11/chartex" xmlns:cx6="http://schemas.microsoft.com/office/drawing/2016/5/12/chartex" xmlns:cx7="http://schemas.microsoft.com/office/drawing/2016/5/13/chartex" xmlns:cx8="http://schemas.microsoft.com/office/drawing/2016/5/14/chartex" xmlns:mc="http://schemas.openxmlformats.org/markup-compatibility/2006" xmlns:aink="http://schemas.microsoft.com/office/drawing/2016/ink" xmlns:am3d="http://schemas.microsoft.com/office/drawing/2017/model3d" xmlns:o="urn:schemas-microsoft-com:office:office" xmlns:oel="http://schemas.microsoft.com/office/2019/extlst" xmlns:r="http://schemas.openxmlformats.org/officeDocument/2006/relationships" xmlns:m="http://schemas.openxmlformats.org/officeDocument/2006/math" xmlns:v="urn:schemas-microsoft-com:vml" xmlns:wp14="http://schemas.microsoft.com/office/word/2010/wordprocessingDrawing" xmlns:wp="http://schemas.openxmlformats.org/drawingml/2006/wordprocessingDrawing" xmlns:w10="urn:schemas-microsoft-com:office:word" xmlns:w="http://schemas.openxmlformats.org/wordprocessingml/2006/main" xmlns:w14="http://schemas.microsoft.com/office/word/2010/wordml" xmlns:w15="http://schemas.microsoft.com/office/word/2012/wordml" xmlns:w16cex="http://schemas.microsoft.com/office/word/2018/wordml/cex" xmlns:w16cid="http://schemas.microsoft.com/office/word/2016/wordml/cid" xmlns:w16="http://schemas.microsoft.com/office/word/2018/wordml" xmlns:w16du="http://schemas.microsoft.com/office/word/2023/wordml/word16du" xmlns:w16sdtdh="http://schemas.microsoft.com/office/word/2020/wordml/sdtdatahash" xmlns:w16sdtfl="http://schemas.microsoft.com/office/word/2024/wordml/sdtformatlock" xmlns:w16se="http://schemas.microsoft.com/office/word/2015/wordml/symex" xmlns:wpg="http://schemas.microsoft.com/office/word/2010/wordprocessingGroup" xmlns:wpi="http://schemas.microsoft.com/office/word/2010/wordprocessingInk" xmlns:wne="http://schemas.microsoft.com/office/word/2006/wordml" xmlns:wps="http://schemas.microsoft.com/office/word/2010/wordprocessingShape" mc:Ignorable="w14 w15 w16se w16cid w16 w16cex w16sdtdh w16sdtfl w16du wp14">
+<w:ftr xmlns:wpc="http://schemas.microsoft.com/office/word/2010/wordprocessingCanvas" xmlns:cx="http://schemas.microsoft.com/office/drawing/2014/chartex" xmlns:cx1="http://schemas.microsoft.com/office/drawing/2015/9/8/chartex" xmlns:cx2="http://schemas.microsoft.com/office/drawing/2015/10/21/chartex" xmlns:cx3="http://schemas.microsoft.com/office/drawing/2016/5/9/chartex" xmlns:cx4="http://schemas.microsoft.com/office/drawing/2016/5/10/chartex" xmlns:cx5="http://schemas.microsoft.com/office/drawing/2016/5/11/chartex" xmlns:cx6="http://schemas.microsoft.com/office/drawing/2016/5/12/chartex" xmlns:cx7="http://schemas.microsoft.com/office/drawing/2016/5/13/chartex" xmlns:cx8="http://schemas.microsoft.com/office/drawing/2016/5/14/chartex" xmlns:mc="http://schemas.openxmlformats.org/markup-compatibility/2006" xmlns:aink="http://schemas.microsoft.com/office/drawing/2016/ink" xmlns:am3d="http://schemas.microsoft.com/office/drawing/2017/model3d" xmlns:o="urn:schemas-microsoft-com:office:office" xmlns:oel="http://schemas.microsoft.com/office/2019/extlst" xmlns:r="http://schemas.openxmlformats.org/officeDocument/2006/relationships" xmlns:m="http://schemas.openxmlformats.org/officeDocument/2006/math" xmlns:v="urn:schemas-microsoft-com:vml" xmlns:wp14="http://schemas.microsoft.com/office/word/2010/wordprocessingDrawing" xmlns:wp="http://schemas.openxmlformats.org/drawingml/2006/wordprocessingDrawing" xmlns:w10="urn:schemas-microsoft-com:office:word" xmlns:w="http://schemas.openxmlformats.org/wordprocessingml/2006/main" xmlns:w14="http://schemas.microsoft.com/office/word/2010/wordml" xmlns:w15="http://schemas.microsoft.com/office/word/2012/wordml" xmlns:w16cex="http://schemas.microsoft.com/office/word/2018/wordml/cex" xmlns:w16cid="http://schemas.microsoft.com/office/word/2016/wordml/cid" xmlns:w16="http://schemas.microsoft.com/office/word/2018/wordml" xmlns:w16du="http://schemas.microsoft.com/office/word/2023/wordml/word16du" xmlns:w16sdtdh="http://schemas.microsoft.com/office/word/2020/wordml/sdtdatahash" xmlns:w16se="http://schemas.microsoft.com/office/word/2015/wordml/symex" xmlns:wpg="http://schemas.microsoft.com/office/word/2010/wordprocessingGroup" xmlns:wpi="http://schemas.microsoft.com/office/word/2010/wordprocessingInk" xmlns:wne="http://schemas.microsoft.com/office/word/2006/wordml" xmlns:wps="http://schemas.microsoft.com/office/word/2010/wordprocessingShape" mc:Ignorable="w14 w15 w16se w16cid w16 w16cex w16sdtdh w16du wp14">
   <w:tbl>
     <w:tblPr>
       <w:tblW w:w="0" w:type="auto"/>
@@ -2235,7 +2411,7 @@
 </file>
 
 <file path=word/footer3.xml><?xml version="1.0" encoding="utf-8"?>
-<w:ftr xmlns:wpc="http://schemas.microsoft.com/office/word/2010/wordprocessingCanvas" xmlns:cx="http://schemas.microsoft.com/office/drawing/2014/chartex" xmlns:cx1="http://schemas.microsoft.com/office/drawing/2015/9/8/chartex" xmlns:cx2="http://schemas.microsoft.com/office/drawing/2015/10/21/chartex" xmlns:cx3="http://schemas.microsoft.com/office/drawing/2016/5/9/chartex" xmlns:cx4="http://schemas.microsoft.com/office/drawing/2016/5/10/chartex" xmlns:cx5="http://schemas.microsoft.com/office/drawing/2016/5/11/chartex" xmlns:cx6="http://schemas.microsoft.com/office/drawing/2016/5/12/chartex" xmlns:cx7="http://schemas.microsoft.com/office/drawing/2016/5/13/chartex" xmlns:cx8="http://schemas.microsoft.com/office/drawing/2016/5/14/chartex" xmlns:mc="http://schemas.openxmlformats.org/markup-compatibility/2006" xmlns:aink="http://schemas.microsoft.com/office/drawing/2016/ink" xmlns:am3d="http://schemas.microsoft.com/office/drawing/2017/model3d" xmlns:o="urn:schemas-microsoft-com:office:office" xmlns:oel="http://schemas.microsoft.com/office/2019/extlst" xmlns:r="http://schemas.openxmlformats.org/officeDocument/2006/relationships" xmlns:m="http://schemas.openxmlformats.org/officeDocument/2006/math" xmlns:v="urn:schemas-microsoft-com:vml" xmlns:wp14="http://schemas.microsoft.com/office/word/2010/wordprocessingDrawing" xmlns:wp="http://schemas.openxmlformats.org/drawingml/2006/wordprocessingDrawing" xmlns:w10="urn:schemas-microsoft-com:office:word" xmlns:w="http://schemas.openxmlformats.org/wordprocessingml/2006/main" xmlns:w14="http://schemas.microsoft.com/office/word/2010/wordml" xmlns:w15="http://schemas.microsoft.com/office/word/2012/wordml" xmlns:w16cex="http://schemas.microsoft.com/office/word/2018/wordml/cex" xmlns:w16cid="http://schemas.microsoft.com/office/word/2016/wordml/cid" xmlns:w16="http://schemas.microsoft.com/office/word/2018/wordml" xmlns:w16du="http://schemas.microsoft.com/office/word/2023/wordml/word16du" xmlns:w16sdtdh="http://schemas.microsoft.com/office/word/2020/wordml/sdtdatahash" xmlns:w16sdtfl="http://schemas.microsoft.com/office/word/2024/wordml/sdtformatlock" xmlns:w16se="http://schemas.microsoft.com/office/word/2015/wordml/symex" xmlns:wpg="http://schemas.microsoft.com/office/word/2010/wordprocessingGroup" xmlns:wpi="http://schemas.microsoft.com/office/word/2010/wordprocessingInk" xmlns:wne="http://schemas.microsoft.com/office/word/2006/wordml" xmlns:wps="http://schemas.microsoft.com/office/word/2010/wordprocessingShape" mc:Ignorable="w14 w15 w16se w16cid w16 w16cex w16sdtdh w16sdtfl w16du wp14">
+<w:ftr xmlns:wpc="http://schemas.microsoft.com/office/word/2010/wordprocessingCanvas" xmlns:cx="http://schemas.microsoft.com/office/drawing/2014/chartex" xmlns:cx1="http://schemas.microsoft.com/office/drawing/2015/9/8/chartex" xmlns:cx2="http://schemas.microsoft.com/office/drawing/2015/10/21/chartex" xmlns:cx3="http://schemas.microsoft.com/office/drawing/2016/5/9/chartex" xmlns:cx4="http://schemas.microsoft.com/office/drawing/2016/5/10/chartex" xmlns:cx5="http://schemas.microsoft.com/office/drawing/2016/5/11/chartex" xmlns:cx6="http://schemas.microsoft.com/office/drawing/2016/5/12/chartex" xmlns:cx7="http://schemas.microsoft.com/office/drawing/2016/5/13/chartex" xmlns:cx8="http://schemas.microsoft.com/office/drawing/2016/5/14/chartex" xmlns:mc="http://schemas.openxmlformats.org/markup-compatibility/2006" xmlns:aink="http://schemas.microsoft.com/office/drawing/2016/ink" xmlns:am3d="http://schemas.microsoft.com/office/drawing/2017/model3d" xmlns:o="urn:schemas-microsoft-com:office:office" xmlns:oel="http://schemas.microsoft.com/office/2019/extlst" xmlns:r="http://schemas.openxmlformats.org/officeDocument/2006/relationships" xmlns:m="http://schemas.openxmlformats.org/officeDocument/2006/math" xmlns:v="urn:schemas-microsoft-com:vml" xmlns:wp14="http://schemas.microsoft.com/office/word/2010/wordprocessingDrawing" xmlns:wp="http://schemas.openxmlformats.org/drawingml/2006/wordprocessingDrawing" xmlns:w10="urn:schemas-microsoft-com:office:word" xmlns:w="http://schemas.openxmlformats.org/wordprocessingml/2006/main" xmlns:w14="http://schemas.microsoft.com/office/word/2010/wordml" xmlns:w15="http://schemas.microsoft.com/office/word/2012/wordml" xmlns:w16cex="http://schemas.microsoft.com/office/word/2018/wordml/cex" xmlns:w16cid="http://schemas.microsoft.com/office/word/2016/wordml/cid" xmlns:w16="http://schemas.microsoft.com/office/word/2018/wordml" xmlns:w16du="http://schemas.microsoft.com/office/word/2023/wordml/word16du" xmlns:w16sdtdh="http://schemas.microsoft.com/office/word/2020/wordml/sdtdatahash" xmlns:w16se="http://schemas.microsoft.com/office/word/2015/wordml/symex" xmlns:wpg="http://schemas.microsoft.com/office/word/2010/wordprocessingGroup" xmlns:wpi="http://schemas.microsoft.com/office/word/2010/wordprocessingInk" xmlns:wne="http://schemas.microsoft.com/office/word/2006/wordml" xmlns:wps="http://schemas.microsoft.com/office/word/2010/wordprocessingShape" mc:Ignorable="w14 w15 w16se w16cid w16 w16cex w16sdtdh w16du wp14">
   <w:p>
     <w:pPr>
       <w:pStyle w:val="Footer"/>
@@ -2245,7 +2421,7 @@
 </file>
 
 <file path=word/footnotes.xml><?xml version="1.0" encoding="utf-8"?>
-<w:footnotes xmlns:wpc="http://schemas.microsoft.com/office/word/2010/wordprocessingCanvas" xmlns:cx="http://schemas.microsoft.com/office/drawing/2014/chartex" xmlns:cx1="http://schemas.microsoft.com/office/drawing/2015/9/8/chartex" xmlns:cx2="http://schemas.microsoft.com/office/drawing/2015/10/21/chartex" xmlns:cx3="http://schemas.microsoft.com/office/drawing/2016/5/9/chartex" xmlns:cx4="http://schemas.microsoft.com/office/drawing/2016/5/10/chartex" xmlns:cx5="http://schemas.microsoft.com/office/drawing/2016/5/11/chartex" xmlns:cx6="http://schemas.microsoft.com/office/drawing/2016/5/12/chartex" xmlns:cx7="http://schemas.microsoft.com/office/drawing/2016/5/13/chartex" xmlns:cx8="http://schemas.microsoft.com/office/drawing/2016/5/14/chartex" xmlns:mc="http://schemas.openxmlformats.org/markup-compatibility/2006" xmlns:aink="http://schemas.microsoft.com/office/drawing/2016/ink" xmlns:am3d="http://schemas.microsoft.com/office/drawing/2017/model3d" xmlns:o="urn:schemas-microsoft-com:office:office" xmlns:oel="http://schemas.microsoft.com/office/2019/extlst" xmlns:r="http://schemas.openxmlformats.org/officeDocument/2006/relationships" xmlns:m="http://schemas.openxmlformats.org/officeDocument/2006/math" xmlns:v="urn:schemas-microsoft-com:vml" xmlns:wp14="http://schemas.microsoft.com/office/word/2010/wordprocessingDrawing" xmlns:wp="http://schemas.openxmlformats.org/drawingml/2006/wordprocessingDrawing" xmlns:w10="urn:schemas-microsoft-com:office:word" xmlns:w="http://schemas.openxmlformats.org/wordprocessingml/2006/main" xmlns:w14="http://schemas.microsoft.com/office/word/2010/wordml" xmlns:w15="http://schemas.microsoft.com/office/word/2012/wordml" xmlns:w16cex="http://schemas.microsoft.com/office/word/2018/wordml/cex" xmlns:w16cid="http://schemas.microsoft.com/office/word/2016/wordml/cid" xmlns:w16="http://schemas.microsoft.com/office/word/2018/wordml" xmlns:w16du="http://schemas.microsoft.com/office/word/2023/wordml/word16du" xmlns:w16sdtdh="http://schemas.microsoft.com/office/word/2020/wordml/sdtdatahash" xmlns:w16sdtfl="http://schemas.microsoft.com/office/word/2024/wordml/sdtformatlock" xmlns:w16se="http://schemas.microsoft.com/office/word/2015/wordml/symex" xmlns:wpg="http://schemas.microsoft.com/office/word/2010/wordprocessingGroup" xmlns:wpi="http://schemas.microsoft.com/office/word/2010/wordprocessingInk" xmlns:wne="http://schemas.microsoft.com/office/word/2006/wordml" xmlns:wps="http://schemas.microsoft.com/office/word/2010/wordprocessingShape" mc:Ignorable="w14 w15 w16se w16cid w16 w16cex w16sdtdh w16sdtfl w16du wp14">
+<w:footnotes xmlns:wpc="http://schemas.microsoft.com/office/word/2010/wordprocessingCanvas" xmlns:cx="http://schemas.microsoft.com/office/drawing/2014/chartex" xmlns:cx1="http://schemas.microsoft.com/office/drawing/2015/9/8/chartex" xmlns:cx2="http://schemas.microsoft.com/office/drawing/2015/10/21/chartex" xmlns:cx3="http://schemas.microsoft.com/office/drawing/2016/5/9/chartex" xmlns:cx4="http://schemas.microsoft.com/office/drawing/2016/5/10/chartex" xmlns:cx5="http://schemas.microsoft.com/office/drawing/2016/5/11/chartex" xmlns:cx6="http://schemas.microsoft.com/office/drawing/2016/5/12/chartex" xmlns:cx7="http://schemas.microsoft.com/office/drawing/2016/5/13/chartex" xmlns:cx8="http://schemas.microsoft.com/office/drawing/2016/5/14/chartex" xmlns:mc="http://schemas.openxmlformats.org/markup-compatibility/2006" xmlns:aink="http://schemas.microsoft.com/office/drawing/2016/ink" xmlns:am3d="http://schemas.microsoft.com/office/drawing/2017/model3d" xmlns:o="urn:schemas-microsoft-com:office:office" xmlns:oel="http://schemas.microsoft.com/office/2019/extlst" xmlns:r="http://schemas.openxmlformats.org/officeDocument/2006/relationships" xmlns:m="http://schemas.openxmlformats.org/officeDocument/2006/math" xmlns:v="urn:schemas-microsoft-com:vml" xmlns:wp14="http://schemas.microsoft.com/office/word/2010/wordprocessingDrawing" xmlns:wp="http://schemas.openxmlformats.org/drawingml/2006/wordprocessingDrawing" xmlns:w10="urn:schemas-microsoft-com:office:word" xmlns:w="http://schemas.openxmlformats.org/wordprocessingml/2006/main" xmlns:w14="http://schemas.microsoft.com/office/word/2010/wordml" xmlns:w15="http://schemas.microsoft.com/office/word/2012/wordml" xmlns:w16cex="http://schemas.microsoft.com/office/word/2018/wordml/cex" xmlns:w16cid="http://schemas.microsoft.com/office/word/2016/wordml/cid" xmlns:w16="http://schemas.microsoft.com/office/word/2018/wordml" xmlns:w16du="http://schemas.microsoft.com/office/word/2023/wordml/word16du" xmlns:w16sdtdh="http://schemas.microsoft.com/office/word/2020/wordml/sdtdatahash" xmlns:w16se="http://schemas.microsoft.com/office/word/2015/wordml/symex" xmlns:wpg="http://schemas.microsoft.com/office/word/2010/wordprocessingGroup" xmlns:wpi="http://schemas.microsoft.com/office/word/2010/wordprocessingInk" xmlns:wne="http://schemas.microsoft.com/office/word/2006/wordml" xmlns:wps="http://schemas.microsoft.com/office/word/2010/wordprocessingShape" mc:Ignorable="w14 w15 w16se w16cid w16 w16cex w16sdtdh w16du wp14">
   <w:footnote w:type="separator" w:id="-1">
     <w:p>
       <w:pPr>
@@ -2270,7 +2446,7 @@
 </file>
 
 <file path=word/header1.xml><?xml version="1.0" encoding="utf-8"?>
-<w:hdr xmlns:wpc="http://schemas.microsoft.com/office/word/2010/wordprocessingCanvas" xmlns:cx="http://schemas.microsoft.com/office/drawing/2014/chartex" xmlns:cx1="http://schemas.microsoft.com/office/drawing/2015/9/8/chartex" xmlns:cx2="http://schemas.microsoft.com/office/drawing/2015/10/21/chartex" xmlns:cx3="http://schemas.microsoft.com/office/drawing/2016/5/9/chartex" xmlns:cx4="http://schemas.microsoft.com/office/drawing/2016/5/10/chartex" xmlns:cx5="http://schemas.microsoft.com/office/drawing/2016/5/11/chartex" xmlns:cx6="http://schemas.microsoft.com/office/drawing/2016/5/12/chartex" xmlns:cx7="http://schemas.microsoft.com/office/drawing/2016/5/13/chartex" xmlns:cx8="http://schemas.microsoft.com/office/drawing/2016/5/14/chartex" xmlns:mc="http://schemas.openxmlformats.org/markup-compatibility/2006" xmlns:aink="http://schemas.microsoft.com/office/drawing/2016/ink" xmlns:am3d="http://schemas.microsoft.com/office/drawing/2017/model3d" xmlns:o="urn:schemas-microsoft-com:office:office" xmlns:oel="http://schemas.microsoft.com/office/2019/extlst" xmlns:r="http://schemas.openxmlformats.org/officeDocument/2006/relationships" xmlns:m="http://schemas.openxmlformats.org/officeDocument/2006/math" xmlns:v="urn:schemas-microsoft-com:vml" xmlns:wp14="http://schemas.microsoft.com/office/word/2010/wordprocessingDrawing" xmlns:wp="http://schemas.openxmlformats.org/drawingml/2006/wordprocessingDrawing" xmlns:w10="urn:schemas-microsoft-com:office:word" xmlns:w="http://schemas.openxmlformats.org/wordprocessingml/2006/main" xmlns:w14="http://schemas.microsoft.com/office/word/2010/wordml" xmlns:w15="http://schemas.microsoft.com/office/word/2012/wordml" xmlns:w16cex="http://schemas.microsoft.com/office/word/2018/wordml/cex" xmlns:w16cid="http://schemas.microsoft.com/office/word/2016/wordml/cid" xmlns:w16="http://schemas.microsoft.com/office/word/2018/wordml" xmlns:w16du="http://schemas.microsoft.com/office/word/2023/wordml/word16du" xmlns:w16sdtdh="http://schemas.microsoft.com/office/word/2020/wordml/sdtdatahash" xmlns:w16sdtfl="http://schemas.microsoft.com/office/word/2024/wordml/sdtformatlock" xmlns:w16se="http://schemas.microsoft.com/office/word/2015/wordml/symex" xmlns:wpg="http://schemas.microsoft.com/office/word/2010/wordprocessingGroup" xmlns:wpi="http://schemas.microsoft.com/office/word/2010/wordprocessingInk" xmlns:wne="http://schemas.microsoft.com/office/word/2006/wordml" xmlns:wps="http://schemas.microsoft.com/office/word/2010/wordprocessingShape" mc:Ignorable="w14 w15 w16se w16cid w16 w16cex w16sdtdh w16sdtfl w16du wp14">
+<w:hdr xmlns:wpc="http://schemas.microsoft.com/office/word/2010/wordprocessingCanvas" xmlns:cx="http://schemas.microsoft.com/office/drawing/2014/chartex" xmlns:cx1="http://schemas.microsoft.com/office/drawing/2015/9/8/chartex" xmlns:cx2="http://schemas.microsoft.com/office/drawing/2015/10/21/chartex" xmlns:cx3="http://schemas.microsoft.com/office/drawing/2016/5/9/chartex" xmlns:cx4="http://schemas.microsoft.com/office/drawing/2016/5/10/chartex" xmlns:cx5="http://schemas.microsoft.com/office/drawing/2016/5/11/chartex" xmlns:cx6="http://schemas.microsoft.com/office/drawing/2016/5/12/chartex" xmlns:cx7="http://schemas.microsoft.com/office/drawing/2016/5/13/chartex" xmlns:cx8="http://schemas.microsoft.com/office/drawing/2016/5/14/chartex" xmlns:mc="http://schemas.openxmlformats.org/markup-compatibility/2006" xmlns:aink="http://schemas.microsoft.com/office/drawing/2016/ink" xmlns:am3d="http://schemas.microsoft.com/office/drawing/2017/model3d" xmlns:o="urn:schemas-microsoft-com:office:office" xmlns:oel="http://schemas.microsoft.com/office/2019/extlst" xmlns:r="http://schemas.openxmlformats.org/officeDocument/2006/relationships" xmlns:m="http://schemas.openxmlformats.org/officeDocument/2006/math" xmlns:v="urn:schemas-microsoft-com:vml" xmlns:wp14="http://schemas.microsoft.com/office/word/2010/wordprocessingDrawing" xmlns:wp="http://schemas.openxmlformats.org/drawingml/2006/wordprocessingDrawing" xmlns:w10="urn:schemas-microsoft-com:office:word" xmlns:w="http://schemas.openxmlformats.org/wordprocessingml/2006/main" xmlns:w14="http://schemas.microsoft.com/office/word/2010/wordml" xmlns:w15="http://schemas.microsoft.com/office/word/2012/wordml" xmlns:w16cex="http://schemas.microsoft.com/office/word/2018/wordml/cex" xmlns:w16cid="http://schemas.microsoft.com/office/word/2016/wordml/cid" xmlns:w16="http://schemas.microsoft.com/office/word/2018/wordml" xmlns:w16du="http://schemas.microsoft.com/office/word/2023/wordml/word16du" xmlns:w16sdtdh="http://schemas.microsoft.com/office/word/2020/wordml/sdtdatahash" xmlns:w16se="http://schemas.microsoft.com/office/word/2015/wordml/symex" xmlns:wpg="http://schemas.microsoft.com/office/word/2010/wordprocessingGroup" xmlns:wpi="http://schemas.microsoft.com/office/word/2010/wordprocessingInk" xmlns:wne="http://schemas.microsoft.com/office/word/2006/wordml" xmlns:wps="http://schemas.microsoft.com/office/word/2010/wordprocessingShape" mc:Ignorable="w14 w15 w16se w16cid w16 w16cex w16sdtdh w16du wp14">
   <w:p>
     <w:pPr>
       <w:rPr>
@@ -2331,7 +2507,7 @@
 </file>
 
 <file path=word/header2.xml><?xml version="1.0" encoding="utf-8"?>
-<w:hdr xmlns:wpc="http://schemas.microsoft.com/office/word/2010/wordprocessingCanvas" xmlns:cx="http://schemas.microsoft.com/office/drawing/2014/chartex" xmlns:cx1="http://schemas.microsoft.com/office/drawing/2015/9/8/chartex" xmlns:cx2="http://schemas.microsoft.com/office/drawing/2015/10/21/chartex" xmlns:cx3="http://schemas.microsoft.com/office/drawing/2016/5/9/chartex" xmlns:cx4="http://schemas.microsoft.com/office/drawing/2016/5/10/chartex" xmlns:cx5="http://schemas.microsoft.com/office/drawing/2016/5/11/chartex" xmlns:cx6="http://schemas.microsoft.com/office/drawing/2016/5/12/chartex" xmlns:cx7="http://schemas.microsoft.com/office/drawing/2016/5/13/chartex" xmlns:cx8="http://schemas.microsoft.com/office/drawing/2016/5/14/chartex" xmlns:mc="http://schemas.openxmlformats.org/markup-compatibility/2006" xmlns:aink="http://schemas.microsoft.com/office/drawing/2016/ink" xmlns:am3d="http://schemas.microsoft.com/office/drawing/2017/model3d" xmlns:o="urn:schemas-microsoft-com:office:office" xmlns:oel="http://schemas.microsoft.com/office/2019/extlst" xmlns:r="http://schemas.openxmlformats.org/officeDocument/2006/relationships" xmlns:m="http://schemas.openxmlformats.org/officeDocument/2006/math" xmlns:v="urn:schemas-microsoft-com:vml" xmlns:wp14="http://schemas.microsoft.com/office/word/2010/wordprocessingDrawing" xmlns:wp="http://schemas.openxmlformats.org/drawingml/2006/wordprocessingDrawing" xmlns:w10="urn:schemas-microsoft-com:office:word" xmlns:w="http://schemas.openxmlformats.org/wordprocessingml/2006/main" xmlns:w14="http://schemas.microsoft.com/office/word/2010/wordml" xmlns:w15="http://schemas.microsoft.com/office/word/2012/wordml" xmlns:w16cex="http://schemas.microsoft.com/office/word/2018/wordml/cex" xmlns:w16cid="http://schemas.microsoft.com/office/word/2016/wordml/cid" xmlns:w16="http://schemas.microsoft.com/office/word/2018/wordml" xmlns:w16du="http://schemas.microsoft.com/office/word/2023/wordml/word16du" xmlns:w16sdtdh="http://schemas.microsoft.com/office/word/2020/wordml/sdtdatahash" xmlns:w16sdtfl="http://schemas.microsoft.com/office/word/2024/wordml/sdtformatlock" xmlns:w16se="http://schemas.microsoft.com/office/word/2015/wordml/symex" xmlns:wpg="http://schemas.microsoft.com/office/word/2010/wordprocessingGroup" xmlns:wpi="http://schemas.microsoft.com/office/word/2010/wordprocessingInk" xmlns:wne="http://schemas.microsoft.com/office/word/2006/wordml" xmlns:wps="http://schemas.microsoft.com/office/word/2010/wordprocessingShape" mc:Ignorable="w14 w15 w16se w16cid w16 w16cex w16sdtdh w16sdtfl w16du wp14">
+<w:hdr xmlns:wpc="http://schemas.microsoft.com/office/word/2010/wordprocessingCanvas" xmlns:cx="http://schemas.microsoft.com/office/drawing/2014/chartex" xmlns:cx1="http://schemas.microsoft.com/office/drawing/2015/9/8/chartex" xmlns:cx2="http://schemas.microsoft.com/office/drawing/2015/10/21/chartex" xmlns:cx3="http://schemas.microsoft.com/office/drawing/2016/5/9/chartex" xmlns:cx4="http://schemas.microsoft.com/office/drawing/2016/5/10/chartex" xmlns:cx5="http://schemas.microsoft.com/office/drawing/2016/5/11/chartex" xmlns:cx6="http://schemas.microsoft.com/office/drawing/2016/5/12/chartex" xmlns:cx7="http://schemas.microsoft.com/office/drawing/2016/5/13/chartex" xmlns:cx8="http://schemas.microsoft.com/office/drawing/2016/5/14/chartex" xmlns:mc="http://schemas.openxmlformats.org/markup-compatibility/2006" xmlns:aink="http://schemas.microsoft.com/office/drawing/2016/ink" xmlns:am3d="http://schemas.microsoft.com/office/drawing/2017/model3d" xmlns:o="urn:schemas-microsoft-com:office:office" xmlns:oel="http://schemas.microsoft.com/office/2019/extlst" xmlns:r="http://schemas.openxmlformats.org/officeDocument/2006/relationships" xmlns:m="http://schemas.openxmlformats.org/officeDocument/2006/math" xmlns:v="urn:schemas-microsoft-com:vml" xmlns:wp14="http://schemas.microsoft.com/office/word/2010/wordprocessingDrawing" xmlns:wp="http://schemas.openxmlformats.org/drawingml/2006/wordprocessingDrawing" xmlns:w10="urn:schemas-microsoft-com:office:word" xmlns:w="http://schemas.openxmlformats.org/wordprocessingml/2006/main" xmlns:w14="http://schemas.microsoft.com/office/word/2010/wordml" xmlns:w15="http://schemas.microsoft.com/office/word/2012/wordml" xmlns:w16cex="http://schemas.microsoft.com/office/word/2018/wordml/cex" xmlns:w16cid="http://schemas.microsoft.com/office/word/2016/wordml/cid" xmlns:w16="http://schemas.microsoft.com/office/word/2018/wordml" xmlns:w16du="http://schemas.microsoft.com/office/word/2023/wordml/word16du" xmlns:w16sdtdh="http://schemas.microsoft.com/office/word/2020/wordml/sdtdatahash" xmlns:w16se="http://schemas.microsoft.com/office/word/2015/wordml/symex" xmlns:wpg="http://schemas.microsoft.com/office/word/2010/wordprocessingGroup" xmlns:wpi="http://schemas.microsoft.com/office/word/2010/wordprocessingInk" xmlns:wne="http://schemas.microsoft.com/office/word/2006/wordml" xmlns:wps="http://schemas.microsoft.com/office/word/2010/wordprocessingShape" mc:Ignorable="w14 w15 w16se w16cid w16 w16cex w16sdtdh w16du wp14">
   <w:tbl>
     <w:tblPr>
       <w:tblW w:w="0" w:type="auto"/>
@@ -2422,7 +2598,7 @@
 </file>
 
 <file path=word/header3.xml><?xml version="1.0" encoding="utf-8"?>
-<w:hdr xmlns:wpc="http://schemas.microsoft.com/office/word/2010/wordprocessingCanvas" xmlns:cx="http://schemas.microsoft.com/office/drawing/2014/chartex" xmlns:cx1="http://schemas.microsoft.com/office/drawing/2015/9/8/chartex" xmlns:cx2="http://schemas.microsoft.com/office/drawing/2015/10/21/chartex" xmlns:cx3="http://schemas.microsoft.com/office/drawing/2016/5/9/chartex" xmlns:cx4="http://schemas.microsoft.com/office/drawing/2016/5/10/chartex" xmlns:cx5="http://schemas.microsoft.com/office/drawing/2016/5/11/chartex" xmlns:cx6="http://schemas.microsoft.com/office/drawing/2016/5/12/chartex" xmlns:cx7="http://schemas.microsoft.com/office/drawing/2016/5/13/chartex" xmlns:cx8="http://schemas.microsoft.com/office/drawing/2016/5/14/chartex" xmlns:mc="http://schemas.openxmlformats.org/markup-compatibility/2006" xmlns:aink="http://schemas.microsoft.com/office/drawing/2016/ink" xmlns:am3d="http://schemas.microsoft.com/office/drawing/2017/model3d" xmlns:o="urn:schemas-microsoft-com:office:office" xmlns:oel="http://schemas.microsoft.com/office/2019/extlst" xmlns:r="http://schemas.openxmlformats.org/officeDocument/2006/relationships" xmlns:m="http://schemas.openxmlformats.org/officeDocument/2006/math" xmlns:v="urn:schemas-microsoft-com:vml" xmlns:wp14="http://schemas.microsoft.com/office/word/2010/wordprocessingDrawing" xmlns:wp="http://schemas.openxmlformats.org/drawingml/2006/wordprocessingDrawing" xmlns:w10="urn:schemas-microsoft-com:office:word" xmlns:w="http://schemas.openxmlformats.org/wordprocessingml/2006/main" xmlns:w14="http://schemas.microsoft.com/office/word/2010/wordml" xmlns:w15="http://schemas.microsoft.com/office/word/2012/wordml" xmlns:w16cex="http://schemas.microsoft.com/office/word/2018/wordml/cex" xmlns:w16cid="http://schemas.microsoft.com/office/word/2016/wordml/cid" xmlns:w16="http://schemas.microsoft.com/office/word/2018/wordml" xmlns:w16du="http://schemas.microsoft.com/office/word/2023/wordml/word16du" xmlns:w16sdtdh="http://schemas.microsoft.com/office/word/2020/wordml/sdtdatahash" xmlns:w16sdtfl="http://schemas.microsoft.com/office/word/2024/wordml/sdtformatlock" xmlns:w16se="http://schemas.microsoft.com/office/word/2015/wordml/symex" xmlns:wpg="http://schemas.microsoft.com/office/word/2010/wordprocessingGroup" xmlns:wpi="http://schemas.microsoft.com/office/word/2010/wordprocessingInk" xmlns:wne="http://schemas.microsoft.com/office/word/2006/wordml" xmlns:wps="http://schemas.microsoft.com/office/word/2010/wordprocessingShape" mc:Ignorable="w14 w15 w16se w16cid w16 w16cex w16sdtdh w16sdtfl w16du wp14">
+<w:hdr xmlns:wpc="http://schemas.microsoft.com/office/word/2010/wordprocessingCanvas" xmlns:cx="http://schemas.microsoft.com/office/drawing/2014/chartex" xmlns:cx1="http://schemas.microsoft.com/office/drawing/2015/9/8/chartex" xmlns:cx2="http://schemas.microsoft.com/office/drawing/2015/10/21/chartex" xmlns:cx3="http://schemas.microsoft.com/office/drawing/2016/5/9/chartex" xmlns:cx4="http://schemas.microsoft.com/office/drawing/2016/5/10/chartex" xmlns:cx5="http://schemas.microsoft.com/office/drawing/2016/5/11/chartex" xmlns:cx6="http://schemas.microsoft.com/office/drawing/2016/5/12/chartex" xmlns:cx7="http://schemas.microsoft.com/office/drawing/2016/5/13/chartex" xmlns:cx8="http://schemas.microsoft.com/office/drawing/2016/5/14/chartex" xmlns:mc="http://schemas.openxmlformats.org/markup-compatibility/2006" xmlns:aink="http://schemas.microsoft.com/office/drawing/2016/ink" xmlns:am3d="http://schemas.microsoft.com/office/drawing/2017/model3d" xmlns:o="urn:schemas-microsoft-com:office:office" xmlns:oel="http://schemas.microsoft.com/office/2019/extlst" xmlns:r="http://schemas.openxmlformats.org/officeDocument/2006/relationships" xmlns:m="http://schemas.openxmlformats.org/officeDocument/2006/math" xmlns:v="urn:schemas-microsoft-com:vml" xmlns:wp14="http://schemas.microsoft.com/office/word/2010/wordprocessingDrawing" xmlns:wp="http://schemas.openxmlformats.org/drawingml/2006/wordprocessingDrawing" xmlns:w10="urn:schemas-microsoft-com:office:word" xmlns:w="http://schemas.openxmlformats.org/wordprocessingml/2006/main" xmlns:w14="http://schemas.microsoft.com/office/word/2010/wordml" xmlns:w15="http://schemas.microsoft.com/office/word/2012/wordml" xmlns:w16cex="http://schemas.microsoft.com/office/word/2018/wordml/cex" xmlns:w16cid="http://schemas.microsoft.com/office/word/2016/wordml/cid" xmlns:w16="http://schemas.microsoft.com/office/word/2018/wordml" xmlns:w16du="http://schemas.microsoft.com/office/word/2023/wordml/word16du" xmlns:w16sdtdh="http://schemas.microsoft.com/office/word/2020/wordml/sdtdatahash" xmlns:w16se="http://schemas.microsoft.com/office/word/2015/wordml/symex" xmlns:wpg="http://schemas.microsoft.com/office/word/2010/wordprocessingGroup" xmlns:wpi="http://schemas.microsoft.com/office/word/2010/wordprocessingInk" xmlns:wne="http://schemas.microsoft.com/office/word/2006/wordml" xmlns:wps="http://schemas.microsoft.com/office/word/2010/wordprocessingShape" mc:Ignorable="w14 w15 w16se w16cid w16 w16cex w16sdtdh w16du wp14">
   <w:p>
     <w:pPr>
       <w:pStyle w:val="Header"/>
@@ -2432,7 +2608,7 @@
 </file>
 
 <file path=word/numbering.xml><?xml version="1.0" encoding="utf-8"?>
-<w:numbering xmlns:wpc="http://schemas.microsoft.com/office/word/2010/wordprocessingCanvas" xmlns:cx="http://schemas.microsoft.com/office/drawing/2014/chartex" xmlns:cx1="http://schemas.microsoft.com/office/drawing/2015/9/8/chartex" xmlns:cx2="http://schemas.microsoft.com/office/drawing/2015/10/21/chartex" xmlns:cx3="http://schemas.microsoft.com/office/drawing/2016/5/9/chartex" xmlns:cx4="http://schemas.microsoft.com/office/drawing/2016/5/10/chartex" xmlns:cx5="http://schemas.microsoft.com/office/drawing/2016/5/11/chartex" xmlns:cx6="http://schemas.microsoft.com/office/drawing/2016/5/12/chartex" xmlns:cx7="http://schemas.microsoft.com/office/drawing/2016/5/13/chartex" xmlns:cx8="http://schemas.microsoft.com/office/drawing/2016/5/14/chartex" xmlns:mc="http://schemas.openxmlformats.org/markup-compatibility/2006" xmlns:aink="http://schemas.microsoft.com/office/drawing/2016/ink" xmlns:am3d="http://schemas.microsoft.com/office/drawing/2017/model3d" xmlns:o="urn:schemas-microsoft-com:office:office" xmlns:oel="http://schemas.microsoft.com/office/2019/extlst" xmlns:r="http://schemas.openxmlformats.org/officeDocument/2006/relationships" xmlns:m="http://schemas.openxmlformats.org/officeDocument/2006/math" xmlns:v="urn:schemas-microsoft-com:vml" xmlns:wp14="http://schemas.microsoft.com/office/word/2010/wordprocessingDrawing" xmlns:wp="http://schemas.openxmlformats.org/drawingml/2006/wordprocessingDrawing" xmlns:w10="urn:schemas-microsoft-com:office:word" xmlns:w="http://schemas.openxmlformats.org/wordprocessingml/2006/main" xmlns:w14="http://schemas.microsoft.com/office/word/2010/wordml" xmlns:w15="http://schemas.microsoft.com/office/word/2012/wordml" xmlns:w16cex="http://schemas.microsoft.com/office/word/2018/wordml/cex" xmlns:w16cid="http://schemas.microsoft.com/office/word/2016/wordml/cid" xmlns:w16="http://schemas.microsoft.com/office/word/2018/wordml" xmlns:w16du="http://schemas.microsoft.com/office/word/2023/wordml/word16du" xmlns:w16sdtdh="http://schemas.microsoft.com/office/word/2020/wordml/sdtdatahash" xmlns:w16sdtfl="http://schemas.microsoft.com/office/word/2024/wordml/sdtformatlock" xmlns:w16se="http://schemas.microsoft.com/office/word/2015/wordml/symex" xmlns:wpg="http://schemas.microsoft.com/office/word/2010/wordprocessingGroup" xmlns:wpi="http://schemas.microsoft.com/office/word/2010/wordprocessingInk" xmlns:wne="http://schemas.microsoft.com/office/word/2006/wordml" xmlns:wps="http://schemas.microsoft.com/office/word/2010/wordprocessingShape" mc:Ignorable="w14 w15 w16se w16cid w16 w16cex w16sdtdh w16sdtfl w16du wp14">
+<w:numbering xmlns:wpc="http://schemas.microsoft.com/office/word/2010/wordprocessingCanvas" xmlns:cx="http://schemas.microsoft.com/office/drawing/2014/chartex" xmlns:cx1="http://schemas.microsoft.com/office/drawing/2015/9/8/chartex" xmlns:cx2="http://schemas.microsoft.com/office/drawing/2015/10/21/chartex" xmlns:cx3="http://schemas.microsoft.com/office/drawing/2016/5/9/chartex" xmlns:cx4="http://schemas.microsoft.com/office/drawing/2016/5/10/chartex" xmlns:cx5="http://schemas.microsoft.com/office/drawing/2016/5/11/chartex" xmlns:cx6="http://schemas.microsoft.com/office/drawing/2016/5/12/chartex" xmlns:cx7="http://schemas.microsoft.com/office/drawing/2016/5/13/chartex" xmlns:cx8="http://schemas.microsoft.com/office/drawing/2016/5/14/chartex" xmlns:mc="http://schemas.openxmlformats.org/markup-compatibility/2006" xmlns:aink="http://schemas.microsoft.com/office/drawing/2016/ink" xmlns:am3d="http://schemas.microsoft.com/office/drawing/2017/model3d" xmlns:o="urn:schemas-microsoft-com:office:office" xmlns:oel="http://schemas.microsoft.com/office/2019/extlst" xmlns:r="http://schemas.openxmlformats.org/officeDocument/2006/relationships" xmlns:m="http://schemas.openxmlformats.org/officeDocument/2006/math" xmlns:v="urn:schemas-microsoft-com:vml" xmlns:wp14="http://schemas.microsoft.com/office/word/2010/wordprocessingDrawing" xmlns:wp="http://schemas.openxmlformats.org/drawingml/2006/wordprocessingDrawing" xmlns:w10="urn:schemas-microsoft-com:office:word" xmlns:w="http://schemas.openxmlformats.org/wordprocessingml/2006/main" xmlns:w14="http://schemas.microsoft.com/office/word/2010/wordml" xmlns:w15="http://schemas.microsoft.com/office/word/2012/wordml" xmlns:w16cex="http://schemas.microsoft.com/office/word/2018/wordml/cex" xmlns:w16cid="http://schemas.microsoft.com/office/word/2016/wordml/cid" xmlns:w16="http://schemas.microsoft.com/office/word/2018/wordml" xmlns:w16du="http://schemas.microsoft.com/office/word/2023/wordml/word16du" xmlns:w16sdtdh="http://schemas.microsoft.com/office/word/2020/wordml/sdtdatahash" xmlns:w16se="http://schemas.microsoft.com/office/word/2015/wordml/symex" xmlns:wpg="http://schemas.microsoft.com/office/word/2010/wordprocessingGroup" xmlns:wpi="http://schemas.microsoft.com/office/word/2010/wordprocessingInk" xmlns:wne="http://schemas.microsoft.com/office/word/2006/wordml" xmlns:wps="http://schemas.microsoft.com/office/word/2010/wordprocessingShape" mc:Ignorable="w14 w15 w16se w16cid w16 w16cex w16sdtdh w16du wp14">
   <w:abstractNum w:abstractNumId="0" w15:restartNumberingAfterBreak="0">
     <w:nsid w:val="FFFFFFFB"/>
     <w:multiLevelType w:val="multilevel"/>
@@ -3037,6 +3213,118 @@
     </w:lvl>
   </w:abstractNum>
   <w:abstractNum w:abstractNumId="14" w15:restartNumberingAfterBreak="0">
+    <w:nsid w:val="36BB695D"/>
+    <w:multiLevelType w:val="hybridMultilevel"/>
+    <w:tmpl w:val="4A2E2682"/>
+    <w:lvl w:ilvl="0" w:tplc="0A5E36BC">
+      <w:numFmt w:val="bullet"/>
+      <w:lvlText w:val="-"/>
+      <w:lvlJc w:val="left"/>
+      <w:pPr>
+        <w:ind w:left="1080" w:hanging="360"/>
+      </w:pPr>
+      <w:rPr>
+        <w:rFonts w:ascii="Times New Roman" w:eastAsia="Times New Roman" w:hAnsi="Times New Roman" w:cs="Times New Roman" w:hint="default"/>
+      </w:rPr>
+    </w:lvl>
+    <w:lvl w:ilvl="1" w:tplc="04090003" w:tentative="1">
+      <w:start w:val="1"/>
+      <w:numFmt w:val="bullet"/>
+      <w:lvlText w:val="o"/>
+      <w:lvlJc w:val="left"/>
+      <w:pPr>
+        <w:ind w:left="1800" w:hanging="360"/>
+      </w:pPr>
+      <w:rPr>
+        <w:rFonts w:ascii="Courier New" w:hAnsi="Courier New" w:cs="Courier New" w:hint="default"/>
+      </w:rPr>
+    </w:lvl>
+    <w:lvl w:ilvl="2" w:tplc="04090005" w:tentative="1">
+      <w:start w:val="1"/>
+      <w:numFmt w:val="bullet"/>
+      <w:lvlText w:val=""/>
+      <w:lvlJc w:val="left"/>
+      <w:pPr>
+        <w:ind w:left="2520" w:hanging="360"/>
+      </w:pPr>
+      <w:rPr>
+        <w:rFonts w:ascii="Wingdings" w:hAnsi="Wingdings" w:hint="default"/>
+      </w:rPr>
+    </w:lvl>
+    <w:lvl w:ilvl="3" w:tplc="04090001" w:tentative="1">
+      <w:start w:val="1"/>
+      <w:numFmt w:val="bullet"/>
+      <w:lvlText w:val=""/>
+      <w:lvlJc w:val="left"/>
+      <w:pPr>
+        <w:ind w:left="3240" w:hanging="360"/>
+      </w:pPr>
+      <w:rPr>
+        <w:rFonts w:ascii="Symbol" w:hAnsi="Symbol" w:hint="default"/>
+      </w:rPr>
+    </w:lvl>
+    <w:lvl w:ilvl="4" w:tplc="04090003" w:tentative="1">
+      <w:start w:val="1"/>
+      <w:numFmt w:val="bullet"/>
+      <w:lvlText w:val="o"/>
+      <w:lvlJc w:val="left"/>
+      <w:pPr>
+        <w:ind w:left="3960" w:hanging="360"/>
+      </w:pPr>
+      <w:rPr>
+        <w:rFonts w:ascii="Courier New" w:hAnsi="Courier New" w:cs="Courier New" w:hint="default"/>
+      </w:rPr>
+    </w:lvl>
+    <w:lvl w:ilvl="5" w:tplc="04090005" w:tentative="1">
+      <w:start w:val="1"/>
+      <w:numFmt w:val="bullet"/>
+      <w:lvlText w:val=""/>
+      <w:lvlJc w:val="left"/>
+      <w:pPr>
+        <w:ind w:left="4680" w:hanging="360"/>
+      </w:pPr>
+      <w:rPr>
+        <w:rFonts w:ascii="Wingdings" w:hAnsi="Wingdings" w:hint="default"/>
+      </w:rPr>
+    </w:lvl>
+    <w:lvl w:ilvl="6" w:tplc="04090001" w:tentative="1">
+      <w:start w:val="1"/>
+      <w:numFmt w:val="bullet"/>
+      <w:lvlText w:val=""/>
+      <w:lvlJc w:val="left"/>
+      <w:pPr>
+        <w:ind w:left="5400" w:hanging="360"/>
+      </w:pPr>
+      <w:rPr>
+        <w:rFonts w:ascii="Symbol" w:hAnsi="Symbol" w:hint="default"/>
+      </w:rPr>
+    </w:lvl>
+    <w:lvl w:ilvl="7" w:tplc="04090003" w:tentative="1">
+      <w:start w:val="1"/>
+      <w:numFmt w:val="bullet"/>
+      <w:lvlText w:val="o"/>
+      <w:lvlJc w:val="left"/>
+      <w:pPr>
+        <w:ind w:left="6120" w:hanging="360"/>
+      </w:pPr>
+      <w:rPr>
+        <w:rFonts w:ascii="Courier New" w:hAnsi="Courier New" w:cs="Courier New" w:hint="default"/>
+      </w:rPr>
+    </w:lvl>
+    <w:lvl w:ilvl="8" w:tplc="04090005" w:tentative="1">
+      <w:start w:val="1"/>
+      <w:numFmt w:val="bullet"/>
+      <w:lvlText w:val=""/>
+      <w:lvlJc w:val="left"/>
+      <w:pPr>
+        <w:ind w:left="6840" w:hanging="360"/>
+      </w:pPr>
+      <w:rPr>
+        <w:rFonts w:ascii="Wingdings" w:hAnsi="Wingdings" w:hint="default"/>
+      </w:rPr>
+    </w:lvl>
+  </w:abstractNum>
+  <w:abstractNum w:abstractNumId="15" w15:restartNumberingAfterBreak="0">
     <w:nsid w:val="3F9A29C7"/>
     <w:multiLevelType w:val="hybridMultilevel"/>
     <w:tmpl w:val="56A436CA"/>
@@ -3148,7 +3436,7 @@
       </w:rPr>
     </w:lvl>
   </w:abstractNum>
-  <w:abstractNum w:abstractNumId="15" w15:restartNumberingAfterBreak="0">
+  <w:abstractNum w:abstractNumId="16" w15:restartNumberingAfterBreak="0">
     <w:nsid w:val="42B97F7B"/>
     <w:multiLevelType w:val="singleLevel"/>
     <w:tmpl w:val="04090001"/>
@@ -3168,7 +3456,7 @@
       </w:rPr>
     </w:lvl>
   </w:abstractNum>
-  <w:abstractNum w:abstractNumId="16" w15:restartNumberingAfterBreak="0">
+  <w:abstractNum w:abstractNumId="17" w15:restartNumberingAfterBreak="0">
     <w:nsid w:val="47C470C2"/>
     <w:multiLevelType w:val="multilevel"/>
     <w:tmpl w:val="1FDA45B4"/>
@@ -3282,7 +3570,7 @@
       </w:pPr>
     </w:lvl>
   </w:abstractNum>
-  <w:abstractNum w:abstractNumId="17" w15:restartNumberingAfterBreak="0">
+  <w:abstractNum w:abstractNumId="18" w15:restartNumberingAfterBreak="0">
     <w:nsid w:val="49E170D0"/>
     <w:multiLevelType w:val="singleLevel"/>
     <w:tmpl w:val="04090001"/>
@@ -3302,7 +3590,7 @@
       </w:rPr>
     </w:lvl>
   </w:abstractNum>
-  <w:abstractNum w:abstractNumId="18" w15:restartNumberingAfterBreak="0">
+  <w:abstractNum w:abstractNumId="19" w15:restartNumberingAfterBreak="0">
     <w:nsid w:val="4F64732B"/>
     <w:multiLevelType w:val="singleLevel"/>
     <w:tmpl w:val="04090001"/>
@@ -3322,7 +3610,7 @@
       </w:rPr>
     </w:lvl>
   </w:abstractNum>
-  <w:abstractNum w:abstractNumId="19" w15:restartNumberingAfterBreak="0">
+  <w:abstractNum w:abstractNumId="20" w15:restartNumberingAfterBreak="0">
     <w:nsid w:val="52DF734E"/>
     <w:multiLevelType w:val="singleLevel"/>
     <w:tmpl w:val="04090001"/>
@@ -3342,7 +3630,119 @@
       </w:rPr>
     </w:lvl>
   </w:abstractNum>
-  <w:abstractNum w:abstractNumId="20" w15:restartNumberingAfterBreak="0">
+  <w:abstractNum w:abstractNumId="21" w15:restartNumberingAfterBreak="0">
+    <w:nsid w:val="593220EC"/>
+    <w:multiLevelType w:val="hybridMultilevel"/>
+    <w:tmpl w:val="F842A7DC"/>
+    <w:lvl w:ilvl="0" w:tplc="4B764ACC">
+      <w:numFmt w:val="bullet"/>
+      <w:lvlText w:val="-"/>
+      <w:lvlJc w:val="left"/>
+      <w:pPr>
+        <w:ind w:left="1080" w:hanging="360"/>
+      </w:pPr>
+      <w:rPr>
+        <w:rFonts w:ascii="Times New Roman" w:eastAsia="Times New Roman" w:hAnsi="Times New Roman" w:cs="Times New Roman" w:hint="default"/>
+      </w:rPr>
+    </w:lvl>
+    <w:lvl w:ilvl="1" w:tplc="04090003">
+      <w:start w:val="1"/>
+      <w:numFmt w:val="bullet"/>
+      <w:lvlText w:val="o"/>
+      <w:lvlJc w:val="left"/>
+      <w:pPr>
+        <w:ind w:left="1800" w:hanging="360"/>
+      </w:pPr>
+      <w:rPr>
+        <w:rFonts w:ascii="Courier New" w:hAnsi="Courier New" w:cs="Courier New" w:hint="default"/>
+      </w:rPr>
+    </w:lvl>
+    <w:lvl w:ilvl="2" w:tplc="04090005">
+      <w:start w:val="1"/>
+      <w:numFmt w:val="bullet"/>
+      <w:lvlText w:val=""/>
+      <w:lvlJc w:val="left"/>
+      <w:pPr>
+        <w:ind w:left="2520" w:hanging="360"/>
+      </w:pPr>
+      <w:rPr>
+        <w:rFonts w:ascii="Wingdings" w:hAnsi="Wingdings" w:hint="default"/>
+      </w:rPr>
+    </w:lvl>
+    <w:lvl w:ilvl="3" w:tplc="04090001" w:tentative="1">
+      <w:start w:val="1"/>
+      <w:numFmt w:val="bullet"/>
+      <w:lvlText w:val=""/>
+      <w:lvlJc w:val="left"/>
+      <w:pPr>
+        <w:ind w:left="3240" w:hanging="360"/>
+      </w:pPr>
+      <w:rPr>
+        <w:rFonts w:ascii="Symbol" w:hAnsi="Symbol" w:hint="default"/>
+      </w:rPr>
+    </w:lvl>
+    <w:lvl w:ilvl="4" w:tplc="04090003" w:tentative="1">
+      <w:start w:val="1"/>
+      <w:numFmt w:val="bullet"/>
+      <w:lvlText w:val="o"/>
+      <w:lvlJc w:val="left"/>
+      <w:pPr>
+        <w:ind w:left="3960" w:hanging="360"/>
+      </w:pPr>
+      <w:rPr>
+        <w:rFonts w:ascii="Courier New" w:hAnsi="Courier New" w:cs="Courier New" w:hint="default"/>
+      </w:rPr>
+    </w:lvl>
+    <w:lvl w:ilvl="5" w:tplc="04090005" w:tentative="1">
+      <w:start w:val="1"/>
+      <w:numFmt w:val="bullet"/>
+      <w:lvlText w:val=""/>
+      <w:lvlJc w:val="left"/>
+      <w:pPr>
+        <w:ind w:left="4680" w:hanging="360"/>
+      </w:pPr>
+      <w:rPr>
+        <w:rFonts w:ascii="Wingdings" w:hAnsi="Wingdings" w:hint="default"/>
+      </w:rPr>
+    </w:lvl>
+    <w:lvl w:ilvl="6" w:tplc="04090001" w:tentative="1">
+      <w:start w:val="1"/>
+      <w:numFmt w:val="bullet"/>
+      <w:lvlText w:val=""/>
+      <w:lvlJc w:val="left"/>
+      <w:pPr>
+        <w:ind w:left="5400" w:hanging="360"/>
+      </w:pPr>
+      <w:rPr>
+        <w:rFonts w:ascii="Symbol" w:hAnsi="Symbol" w:hint="default"/>
+      </w:rPr>
+    </w:lvl>
+    <w:lvl w:ilvl="7" w:tplc="04090003" w:tentative="1">
+      <w:start w:val="1"/>
+      <w:numFmt w:val="bullet"/>
+      <w:lvlText w:val="o"/>
+      <w:lvlJc w:val="left"/>
+      <w:pPr>
+        <w:ind w:left="6120" w:hanging="360"/>
+      </w:pPr>
+      <w:rPr>
+        <w:rFonts w:ascii="Courier New" w:hAnsi="Courier New" w:cs="Courier New" w:hint="default"/>
+      </w:rPr>
+    </w:lvl>
+    <w:lvl w:ilvl="8" w:tplc="04090005" w:tentative="1">
+      <w:start w:val="1"/>
+      <w:numFmt w:val="bullet"/>
+      <w:lvlText w:val=""/>
+      <w:lvlJc w:val="left"/>
+      <w:pPr>
+        <w:ind w:left="6840" w:hanging="360"/>
+      </w:pPr>
+      <w:rPr>
+        <w:rFonts w:ascii="Wingdings" w:hAnsi="Wingdings" w:hint="default"/>
+      </w:rPr>
+    </w:lvl>
+  </w:abstractNum>
+  <w:abstractNum w:abstractNumId="22" w15:restartNumberingAfterBreak="0">
     <w:nsid w:val="5EFE756A"/>
     <w:multiLevelType w:val="hybridMultilevel"/>
     <w:tmpl w:val="F9C0F988"/>
@@ -3454,7 +3854,7 @@
       </w:rPr>
     </w:lvl>
   </w:abstractNum>
-  <w:abstractNum w:abstractNumId="21" w15:restartNumberingAfterBreak="0">
+  <w:abstractNum w:abstractNumId="23" w15:restartNumberingAfterBreak="0">
     <w:nsid w:val="6D2F7D46"/>
     <w:multiLevelType w:val="singleLevel"/>
     <w:tmpl w:val="04090001"/>
@@ -3474,7 +3874,7 @@
       </w:rPr>
     </w:lvl>
   </w:abstractNum>
-  <w:abstractNum w:abstractNumId="22" w15:restartNumberingAfterBreak="0">
+  <w:abstractNum w:abstractNumId="24" w15:restartNumberingAfterBreak="0">
     <w:nsid w:val="71F21F2A"/>
     <w:multiLevelType w:val="singleLevel"/>
     <w:tmpl w:val="04090001"/>
@@ -3494,7 +3894,7 @@
       </w:rPr>
     </w:lvl>
   </w:abstractNum>
-  <w:abstractNum w:abstractNumId="23" w15:restartNumberingAfterBreak="0">
+  <w:abstractNum w:abstractNumId="25" w15:restartNumberingAfterBreak="0">
     <w:nsid w:val="743601FB"/>
     <w:multiLevelType w:val="singleLevel"/>
     <w:tmpl w:val="04090001"/>
@@ -3514,7 +3914,7 @@
       </w:rPr>
     </w:lvl>
   </w:abstractNum>
-  <w:abstractNum w:abstractNumId="24" w15:restartNumberingAfterBreak="0">
+  <w:abstractNum w:abstractNumId="26" w15:restartNumberingAfterBreak="0">
     <w:nsid w:val="74D569E2"/>
     <w:multiLevelType w:val="hybridMultilevel"/>
     <w:tmpl w:val="0FC2D632"/>
@@ -3626,7 +4026,7 @@
       </w:rPr>
     </w:lvl>
   </w:abstractNum>
-  <w:abstractNum w:abstractNumId="25" w15:restartNumberingAfterBreak="0">
+  <w:abstractNum w:abstractNumId="27" w15:restartNumberingAfterBreak="0">
     <w:nsid w:val="75297224"/>
     <w:multiLevelType w:val="hybridMultilevel"/>
     <w:tmpl w:val="2CA07ED8"/>
@@ -3738,7 +4138,7 @@
       </w:rPr>
     </w:lvl>
   </w:abstractNum>
-  <w:abstractNum w:abstractNumId="26" w15:restartNumberingAfterBreak="0">
+  <w:abstractNum w:abstractNumId="28" w15:restartNumberingAfterBreak="0">
     <w:nsid w:val="756150CA"/>
     <w:multiLevelType w:val="singleLevel"/>
     <w:tmpl w:val="04090001"/>
@@ -3758,7 +4158,7 @@
       </w:rPr>
     </w:lvl>
   </w:abstractNum>
-  <w:abstractNum w:abstractNumId="27" w15:restartNumberingAfterBreak="0">
+  <w:abstractNum w:abstractNumId="29" w15:restartNumberingAfterBreak="0">
     <w:nsid w:val="7BE434D7"/>
     <w:multiLevelType w:val="singleLevel"/>
     <w:tmpl w:val="04090001"/>
@@ -3785,13 +4185,13 @@
     <w:abstractNumId w:val="12"/>
   </w:num>
   <w:num w:numId="3" w16cid:durableId="2127961893">
-    <w:abstractNumId w:val="27"/>
+    <w:abstractNumId w:val="29"/>
   </w:num>
   <w:num w:numId="4" w16cid:durableId="1976328774">
-    <w:abstractNumId w:val="19"/>
+    <w:abstractNumId w:val="20"/>
   </w:num>
   <w:num w:numId="5" w16cid:durableId="1575972744">
-    <w:abstractNumId w:val="18"/>
+    <w:abstractNumId w:val="19"/>
   </w:num>
   <w:num w:numId="6" w16cid:durableId="152109888">
     <w:abstractNumId w:val="1"/>
@@ -3814,7 +4214,7 @@
     <w:abstractNumId w:val="2"/>
   </w:num>
   <w:num w:numId="8" w16cid:durableId="1457212300">
-    <w:abstractNumId w:val="26"/>
+    <w:abstractNumId w:val="28"/>
   </w:num>
   <w:num w:numId="9" w16cid:durableId="2020042611">
     <w:abstractNumId w:val="3"/>
@@ -3826,7 +4226,7 @@
     <w:abstractNumId w:val="10"/>
   </w:num>
   <w:num w:numId="12" w16cid:durableId="1373772660">
-    <w:abstractNumId w:val="23"/>
+    <w:abstractNumId w:val="25"/>
   </w:num>
   <w:num w:numId="13" w16cid:durableId="1937903031">
     <w:abstractNumId w:val="9"/>
@@ -3835,16 +4235,16 @@
     <w:abstractNumId w:val="6"/>
   </w:num>
   <w:num w:numId="15" w16cid:durableId="349988167">
-    <w:abstractNumId w:val="22"/>
+    <w:abstractNumId w:val="24"/>
   </w:num>
   <w:num w:numId="16" w16cid:durableId="664280071">
-    <w:abstractNumId w:val="17"/>
+    <w:abstractNumId w:val="18"/>
   </w:num>
   <w:num w:numId="17" w16cid:durableId="1752314264">
     <w:abstractNumId w:val="7"/>
   </w:num>
   <w:num w:numId="18" w16cid:durableId="1069495068">
-    <w:abstractNumId w:val="15"/>
+    <w:abstractNumId w:val="16"/>
   </w:num>
   <w:num w:numId="19" w16cid:durableId="1985427359">
     <w:abstractNumId w:val="1"/>
@@ -3868,25 +4268,25 @@
     <w:abstractNumId w:val="8"/>
   </w:num>
   <w:num w:numId="21" w16cid:durableId="938172042">
-    <w:abstractNumId w:val="21"/>
+    <w:abstractNumId w:val="23"/>
   </w:num>
   <w:num w:numId="22" w16cid:durableId="1310209938">
-    <w:abstractNumId w:val="16"/>
+    <w:abstractNumId w:val="17"/>
   </w:num>
   <w:num w:numId="23" w16cid:durableId="2031295081">
-    <w:abstractNumId w:val="14"/>
+    <w:abstractNumId w:val="15"/>
   </w:num>
   <w:num w:numId="24" w16cid:durableId="1380471072">
     <w:abstractNumId w:val="11"/>
   </w:num>
   <w:num w:numId="25" w16cid:durableId="66658407">
-    <w:abstractNumId w:val="25"/>
+    <w:abstractNumId w:val="27"/>
   </w:num>
   <w:num w:numId="26" w16cid:durableId="1260870447">
-    <w:abstractNumId w:val="24"/>
+    <w:abstractNumId w:val="26"/>
   </w:num>
   <w:num w:numId="27" w16cid:durableId="1632132212">
-    <w:abstractNumId w:val="20"/>
+    <w:abstractNumId w:val="22"/>
   </w:num>
   <w:num w:numId="28" w16cid:durableId="749739763">
     <w:abstractNumId w:val="4"/>
@@ -3894,11 +4294,17 @@
   <w:num w:numId="29" w16cid:durableId="1009865696">
     <w:abstractNumId w:val="5"/>
   </w:num>
+  <w:num w:numId="30" w16cid:durableId="387263917">
+    <w:abstractNumId w:val="14"/>
+  </w:num>
+  <w:num w:numId="31" w16cid:durableId="898829710">
+    <w:abstractNumId w:val="21"/>
+  </w:num>
 </w:numbering>
 </file>
 
 <file path=word/styles.xml><?xml version="1.0" encoding="utf-8"?>
-<w:styles xmlns:mc="http://schemas.openxmlformats.org/markup-compatibility/2006" xmlns:r="http://schemas.openxmlformats.org/officeDocument/2006/relationships" xmlns:w="http://schemas.openxmlformats.org/wordprocessingml/2006/main" xmlns:w14="http://schemas.microsoft.com/office/word/2010/wordml" xmlns:w15="http://schemas.microsoft.com/office/word/2012/wordml" xmlns:w16cex="http://schemas.microsoft.com/office/word/2018/wordml/cex" xmlns:w16cid="http://schemas.microsoft.com/office/word/2016/wordml/cid" xmlns:w16="http://schemas.microsoft.com/office/word/2018/wordml" xmlns:w16du="http://schemas.microsoft.com/office/word/2023/wordml/word16du" xmlns:w16sdtdh="http://schemas.microsoft.com/office/word/2020/wordml/sdtdatahash" xmlns:w16sdtfl="http://schemas.microsoft.com/office/word/2024/wordml/sdtformatlock" xmlns:w16se="http://schemas.microsoft.com/office/word/2015/wordml/symex" mc:Ignorable="w14 w15 w16se w16cid w16 w16cex w16sdtdh w16sdtfl w16du">
+<w:styles xmlns:mc="http://schemas.openxmlformats.org/markup-compatibility/2006" xmlns:r="http://schemas.openxmlformats.org/officeDocument/2006/relationships" xmlns:w="http://schemas.openxmlformats.org/wordprocessingml/2006/main" xmlns:w14="http://schemas.microsoft.com/office/word/2010/wordml" xmlns:w15="http://schemas.microsoft.com/office/word/2012/wordml" xmlns:w16cex="http://schemas.microsoft.com/office/word/2018/wordml/cex" xmlns:w16cid="http://schemas.microsoft.com/office/word/2016/wordml/cid" xmlns:w16="http://schemas.microsoft.com/office/word/2018/wordml" xmlns:w16du="http://schemas.microsoft.com/office/word/2023/wordml/word16du" xmlns:w16sdtdh="http://schemas.microsoft.com/office/word/2020/wordml/sdtdatahash" xmlns:w16se="http://schemas.microsoft.com/office/word/2015/wordml/symex" mc:Ignorable="w14 w15 w16se w16cid w16 w16cex w16sdtdh w16du">
   <w:docDefaults>
     <w:rPrDefault>
       <w:rPr>
@@ -5147,11 +5553,12 @@
 </file>
 
 <file path=customXml/item1.xml><?xml version="1.0" encoding="utf-8"?>
-<p:properties xmlns:p="http://schemas.microsoft.com/office/2006/metadata/properties" xmlns:xsi="http://www.w3.org/2001/XMLSchema-instance" xmlns:pc="http://schemas.microsoft.com/office/infopath/2007/PartnerControls">
-  <documentManagement>
-    <_activity xmlns="a61b5c64-63b7-4a2d-b3f2-a16afc21518c" xsi:nil="true"/>
-  </documentManagement>
-</p:properties>
+<?mso-contentType ?>
+<FormTemplates xmlns="http://schemas.microsoft.com/sharepoint/v3/contenttype/forms">
+  <Display>DocumentLibraryForm</Display>
+  <Edit>DocumentLibraryForm</Edit>
+  <New>DocumentLibraryForm</New>
+</FormTemplates>
 </file>
 
 <file path=customXml/item2.xml><?xml version="1.0" encoding="utf-8"?>
@@ -5349,20 +5756,17 @@
 </file>
 
 <file path=customXml/item3.xml><?xml version="1.0" encoding="utf-8"?>
-<?mso-contentType ?>
-<FormTemplates xmlns="http://schemas.microsoft.com/sharepoint/v3/contenttype/forms">
-  <Display>DocumentLibraryForm</Display>
-  <Edit>DocumentLibraryForm</Edit>
-  <New>DocumentLibraryForm</New>
-</FormTemplates>
+<p:properties xmlns:p="http://schemas.microsoft.com/office/2006/metadata/properties" xmlns:xsi="http://www.w3.org/2001/XMLSchema-instance" xmlns:pc="http://schemas.microsoft.com/office/infopath/2007/PartnerControls">
+  <documentManagement>
+    <_activity xmlns="a61b5c64-63b7-4a2d-b3f2-a16afc21518c" xsi:nil="true"/>
+  </documentManagement>
+</p:properties>
 </file>
 
 <file path=customXml/itemProps1.xml><?xml version="1.0" encoding="utf-8"?>
-<ds:datastoreItem xmlns:ds="http://schemas.openxmlformats.org/officeDocument/2006/customXml" ds:itemID="{B6B7DD65-1A33-4899-A019-F679D2B0A253}">
+<ds:datastoreItem xmlns:ds="http://schemas.openxmlformats.org/officeDocument/2006/customXml" ds:itemID="{7E168481-9441-4343-9BB5-69D52086740A}">
   <ds:schemaRefs>
-    <ds:schemaRef ds:uri="http://schemas.microsoft.com/office/2006/metadata/properties"/>
-    <ds:schemaRef ds:uri="http://schemas.microsoft.com/office/infopath/2007/PartnerControls"/>
-    <ds:schemaRef ds:uri="a61b5c64-63b7-4a2d-b3f2-a16afc21518c"/>
+    <ds:schemaRef ds:uri="http://schemas.microsoft.com/sharepoint/v3/contenttype/forms"/>
   </ds:schemaRefs>
 </ds:datastoreItem>
 </file>
@@ -5386,9 +5790,11 @@
 </file>
 
 <file path=customXml/itemProps3.xml><?xml version="1.0" encoding="utf-8"?>
-<ds:datastoreItem xmlns:ds="http://schemas.openxmlformats.org/officeDocument/2006/customXml" ds:itemID="{7E168481-9441-4343-9BB5-69D52086740A}">
+<ds:datastoreItem xmlns:ds="http://schemas.openxmlformats.org/officeDocument/2006/customXml" ds:itemID="{B6B7DD65-1A33-4899-A019-F679D2B0A253}">
   <ds:schemaRefs>
-    <ds:schemaRef ds:uri="http://schemas.microsoft.com/sharepoint/v3/contenttype/forms"/>
+    <ds:schemaRef ds:uri="http://schemas.microsoft.com/office/2006/metadata/properties"/>
+    <ds:schemaRef ds:uri="http://schemas.microsoft.com/office/infopath/2007/PartnerControls"/>
+    <ds:schemaRef ds:uri="a61b5c64-63b7-4a2d-b3f2-a16afc21518c"/>
   </ds:schemaRefs>
 </ds:datastoreItem>
 </file>
</xml_diff>